<commit_message>
docs: organize academic deliverables
</commit_message>
<xml_diff>
--- a/ATIVIDADE_EXTENSIONISTA_II_TRABALHO_FINAL_LEANDRO_ANDALAFT.docx
+++ b/ATIVIDADE_EXTENSIONISTA_II_TRABALHO_FINAL_LEANDRO_ANDALAFT.docx
@@ -4,139 +4,66 @@
   <w:body>
     <w:p>
       <w:pPr>
-        <w:spacing w:after="80"/>
         <w:jc w:val="center"/>
       </w:pPr>
       <w:r>
         <w:rPr>
-          <w:rFonts w:ascii="Calibri" w:hAnsi="Calibri"/>
           <w:b/>
-          <w:color w:val="292F63"/>
-          <w:sz w:val="38"/>
+          <w:color w:val="26315F"/>
+          <w:sz w:val="44"/>
         </w:rPr>
-        <w:t>ATIVIDADES EXTENSIONISTAS</w:t>
+        <w:t>Atividade Extensionista II - Trabalho Final</w:t>
       </w:r>
     </w:p>
     <w:p>
       <w:pPr>
-        <w:spacing w:after="240"/>
         <w:jc w:val="center"/>
       </w:pPr>
       <w:r>
         <w:rPr>
-          <w:rFonts w:ascii="Calibri" w:hAnsi="Calibri"/>
           <w:b/>
-          <w:color w:val="596379"/>
-          <w:sz w:val="21"/>
+          <w:color w:val="1D4ED8"/>
+          <w:sz w:val="30"/>
         </w:rPr>
-        <w:t>Trabalho Final - Atividade Extensionista II: Tecnologia Aplicada a Inclusao Digital - Projeto</w:t>
+        <w:t>Prontuário Unificado MDM</w:t>
       </w:r>
     </w:p>
+    <w:p>
+      <w:pPr>
+        <w:jc w:val="center"/>
+      </w:pPr>
+      <w:r>
+        <w:t>Leandro Andalaft dos Santos Junior | RU 4548358</w:t>
+        <w:br/>
+        <w:t>CST em Análise e Desenvolvimento de Sistemas</w:t>
+        <w:br/>
+        <w:t>Médicos do Mundo - Santos-SP e Itanhaém-SP</w:t>
+      </w:r>
+    </w:p>
+    <w:p/>
     <w:tbl>
       <w:tblPr>
+        <w:tblStyle w:val="TableGrid"/>
         <w:tblW w:type="auto" w:w="0"/>
         <w:jc w:val="center"/>
         <w:tblLook w:firstColumn="1" w:firstRow="1" w:lastColumn="0" w:lastRow="0" w:noHBand="0" w:noVBand="1" w:val="04A0"/>
       </w:tblPr>
       <w:tblGrid>
-        <w:gridCol w:w="9936"/>
+        <w:gridCol w:w="4730"/>
+        <w:gridCol w:w="4730"/>
       </w:tblGrid>
       <w:tr>
         <w:tc>
           <w:tcPr>
-            <w:tcW w:type="dxa" w:w="9936"/>
-            <w:shd w:fill="EAFBF2"/>
-            <w:tcBorders>
-              <w:top w:val="single" w:sz="10" w:space="0" w:color="B8C7E6"/>
-              <w:left w:val="single" w:sz="10" w:space="0" w:color="B8C7E6"/>
-              <w:bottom w:val="single" w:sz="10" w:space="0" w:color="B8C7E6"/>
-              <w:right w:val="single" w:sz="10" w:space="0" w:color="B8C7E6"/>
-            </w:tcBorders>
+            <w:tcW w:type="dxa" w:w="4730"/>
+            <w:vAlign w:val="center"/>
+            <w:shd w:fill="E8EEF5"/>
           </w:tcPr>
           <w:p>
-            <w:pPr>
-              <w:spacing w:after="60"/>
-            </w:pPr>
+            <w:r/>
             <w:r>
               <w:rPr>
-                <w:rFonts w:ascii="Calibri" w:hAnsi="Calibri"/>
                 <w:b/>
-                <w:color w:val="292F63"/>
-                <w:sz w:val="21"/>
-              </w:rPr>
-              <w:t>Projeto aplicado</w:t>
-            </w:r>
-          </w:p>
-          <w:p>
-            <w:pPr>
-              <w:spacing w:after="0"/>
-            </w:pPr>
-            <w:r>
-              <w:rPr>
-                <w:rFonts w:ascii="Calibri" w:hAnsi="Calibri"/>
-                <w:b w:val="0"/>
-                <w:color w:val="596379"/>
-                <w:sz w:val="19"/>
-              </w:rPr>
-              <w:t>Sistema web responsivo para cadastro, triagem, prontuario multiprofissional, fila de espera, indicadores e exportacao de dados em acoes da Medicos do Mundo em Santos-SP e Itanhaem-SP.</w:t>
-            </w:r>
-          </w:p>
-        </w:tc>
-      </w:tr>
-    </w:tbl>
-    <w:p>
-      <w:pPr>
-        <w:spacing w:after="40"/>
-      </w:pPr>
-    </w:p>
-    <w:p>
-      <w:pPr>
-        <w:pStyle w:val="Heading1"/>
-        <w:spacing w:before="240" w:after="100"/>
-      </w:pPr>
-      <w:r>
-        <w:rPr>
-          <w:rFonts w:ascii="Calibri" w:hAnsi="Calibri"/>
-          <w:b/>
-          <w:color w:val="292F63"/>
-          <w:sz w:val="32"/>
-        </w:rPr>
-        <w:t>Identificacao</w:t>
-      </w:r>
-    </w:p>
-    <w:tbl>
-      <w:tblPr>
-        <w:tblW w:type="auto" w:w="0"/>
-        <w:jc w:val="center"/>
-        <w:tblLayout w:type="fixed"/>
-        <w:tblLook w:firstColumn="1" w:firstRow="1" w:lastColumn="0" w:lastRow="0" w:noHBand="0" w:noVBand="1" w:val="04A0"/>
-      </w:tblPr>
-      <w:tblGrid>
-        <w:gridCol w:w="4968"/>
-        <w:gridCol w:w="4968"/>
-      </w:tblGrid>
-      <w:tr>
-        <w:tc>
-          <w:tcPr>
-            <w:tcW w:type="dxa" w:w="2088"/>
-            <w:vAlign w:val="center"/>
-            <w:shd w:fill="EAF1FF"/>
-            <w:tcBorders>
-              <w:top w:val="single" w:sz="8" w:space="0" w:color="D8DEE9"/>
-              <w:left w:val="single" w:sz="8" w:space="0" w:color="D8DEE9"/>
-              <w:bottom w:val="single" w:sz="8" w:space="0" w:color="D8DEE9"/>
-              <w:right w:val="single" w:sz="8" w:space="0" w:color="D8DEE9"/>
-            </w:tcBorders>
-          </w:tcPr>
-          <w:p>
-            <w:pPr>
-              <w:jc w:val="center"/>
-            </w:pPr>
-            <w:r>
-              <w:rPr>
-                <w:rFonts w:ascii="Calibri" w:hAnsi="Calibri"/>
-                <w:b/>
-                <w:color w:val="292F63"/>
                 <w:sz w:val="18"/>
               </w:rPr>
               <w:t>Campo</w:t>
@@ -145,28 +72,18 @@
         </w:tc>
         <w:tc>
           <w:tcPr>
-            <w:tcW w:type="dxa" w:w="6984"/>
+            <w:tcW w:type="dxa" w:w="4730"/>
             <w:vAlign w:val="center"/>
-            <w:shd w:fill="EAF1FF"/>
-            <w:tcBorders>
-              <w:top w:val="single" w:sz="8" w:space="0" w:color="D8DEE9"/>
-              <w:left w:val="single" w:sz="8" w:space="0" w:color="D8DEE9"/>
-              <w:bottom w:val="single" w:sz="8" w:space="0" w:color="D8DEE9"/>
-              <w:right w:val="single" w:sz="8" w:space="0" w:color="D8DEE9"/>
-            </w:tcBorders>
+            <w:shd w:fill="E8EEF5"/>
           </w:tcPr>
           <w:p>
-            <w:pPr>
-              <w:jc w:val="center"/>
-            </w:pPr>
+            <w:r/>
             <w:r>
               <w:rPr>
-                <w:rFonts w:ascii="Calibri" w:hAnsi="Calibri"/>
                 <w:b/>
-                <w:color w:val="292F63"/>
                 <w:sz w:val="18"/>
               </w:rPr>
-              <w:t>Informacao</w:t>
+              <w:t>Descricao</w:t>
             </w:r>
           </w:p>
         </w:tc>
@@ -174,74 +91,13 @@
       <w:tr>
         <w:tc>
           <w:tcPr>
-            <w:tcW w:type="dxa" w:w="2088"/>
+            <w:tcW w:type="dxa" w:w="4730"/>
             <w:vAlign w:val="center"/>
-            <w:tcBorders>
-              <w:top w:val="single" w:sz="8" w:space="0" w:color="D8DEE9"/>
-              <w:left w:val="single" w:sz="8" w:space="0" w:color="D8DEE9"/>
-              <w:bottom w:val="single" w:sz="8" w:space="0" w:color="D8DEE9"/>
-              <w:right w:val="single" w:sz="8" w:space="0" w:color="D8DEE9"/>
-            </w:tcBorders>
           </w:tcPr>
           <w:p>
-            <w:pPr>
-              <w:spacing w:after="0"/>
-            </w:pPr>
+            <w:r/>
             <w:r>
               <w:rPr>
-                <w:rFonts w:ascii="Calibri" w:hAnsi="Calibri"/>
-                <w:b w:val="0"/>
-                <w:sz w:val="18"/>
-              </w:rPr>
-              <w:t>Curso</w:t>
-            </w:r>
-          </w:p>
-        </w:tc>
-        <w:tc>
-          <w:tcPr>
-            <w:tcW w:type="dxa" w:w="6984"/>
-            <w:vAlign w:val="center"/>
-            <w:tcBorders>
-              <w:top w:val="single" w:sz="8" w:space="0" w:color="D8DEE9"/>
-              <w:left w:val="single" w:sz="8" w:space="0" w:color="D8DEE9"/>
-              <w:bottom w:val="single" w:sz="8" w:space="0" w:color="D8DEE9"/>
-              <w:right w:val="single" w:sz="8" w:space="0" w:color="D8DEE9"/>
-            </w:tcBorders>
-          </w:tcPr>
-          <w:p>
-            <w:pPr>
-              <w:spacing w:after="0"/>
-            </w:pPr>
-            <w:r>
-              <w:rPr>
-                <w:rFonts w:ascii="Calibri" w:hAnsi="Calibri"/>
-                <w:b w:val="0"/>
-                <w:sz w:val="18"/>
-              </w:rPr>
-              <w:t>( x ) CST em Analise e Desenvolvimento de Sistemas</w:t>
-            </w:r>
-          </w:p>
-        </w:tc>
-      </w:tr>
-      <w:tr>
-        <w:tc>
-          <w:tcPr>
-            <w:tcW w:type="dxa" w:w="2088"/>
-            <w:vAlign w:val="center"/>
-            <w:tcBorders>
-              <w:top w:val="single" w:sz="8" w:space="0" w:color="D8DEE9"/>
-              <w:left w:val="single" w:sz="8" w:space="0" w:color="D8DEE9"/>
-              <w:bottom w:val="single" w:sz="8" w:space="0" w:color="D8DEE9"/>
-              <w:right w:val="single" w:sz="8" w:space="0" w:color="D8DEE9"/>
-            </w:tcBorders>
-          </w:tcPr>
-          <w:p>
-            <w:pPr>
-              <w:spacing w:after="0"/>
-            </w:pPr>
-            <w:r>
-              <w:rPr>
-                <w:rFonts w:ascii="Calibri" w:hAnsi="Calibri"/>
                 <w:b w:val="0"/>
                 <w:sz w:val="18"/>
               </w:rPr>
@@ -251,26 +107,17 @@
         </w:tc>
         <w:tc>
           <w:tcPr>
-            <w:tcW w:type="dxa" w:w="6984"/>
+            <w:tcW w:type="dxa" w:w="4730"/>
             <w:vAlign w:val="center"/>
-            <w:tcBorders>
-              <w:top w:val="single" w:sz="8" w:space="0" w:color="D8DEE9"/>
-              <w:left w:val="single" w:sz="8" w:space="0" w:color="D8DEE9"/>
-              <w:bottom w:val="single" w:sz="8" w:space="0" w:color="D8DEE9"/>
-              <w:right w:val="single" w:sz="8" w:space="0" w:color="D8DEE9"/>
-            </w:tcBorders>
           </w:tcPr>
           <w:p>
-            <w:pPr>
-              <w:spacing w:after="0"/>
-            </w:pPr>
+            <w:r/>
             <w:r>
               <w:rPr>
-                <w:rFonts w:ascii="Calibri" w:hAnsi="Calibri"/>
                 <w:b w:val="0"/>
                 <w:sz w:val="18"/>
               </w:rPr>
-              <w:t>( x ) Atividade Extensionista II: Tecnologia Aplicada a Inclusao Digital - Projeto</w:t>
+              <w:t>Atividade Extensionista II: Tecnologia Aplicada a Inclusão Digital - Projeto</w:t>
             </w:r>
           </w:p>
         </w:tc>
@@ -278,22 +125,13 @@
       <w:tr>
         <w:tc>
           <w:tcPr>
-            <w:tcW w:type="dxa" w:w="2088"/>
+            <w:tcW w:type="dxa" w:w="4730"/>
             <w:vAlign w:val="center"/>
-            <w:tcBorders>
-              <w:top w:val="single" w:sz="8" w:space="0" w:color="D8DEE9"/>
-              <w:left w:val="single" w:sz="8" w:space="0" w:color="D8DEE9"/>
-              <w:bottom w:val="single" w:sz="8" w:space="0" w:color="D8DEE9"/>
-              <w:right w:val="single" w:sz="8" w:space="0" w:color="D8DEE9"/>
-            </w:tcBorders>
           </w:tcPr>
           <w:p>
-            <w:pPr>
-              <w:spacing w:after="0"/>
-            </w:pPr>
+            <w:r/>
             <w:r>
               <w:rPr>
-                <w:rFonts w:ascii="Calibri" w:hAnsi="Calibri"/>
                 <w:b w:val="0"/>
                 <w:sz w:val="18"/>
               </w:rPr>
@@ -303,26 +141,17 @@
         </w:tc>
         <w:tc>
           <w:tcPr>
-            <w:tcW w:type="dxa" w:w="6984"/>
+            <w:tcW w:type="dxa" w:w="4730"/>
             <w:vAlign w:val="center"/>
-            <w:tcBorders>
-              <w:top w:val="single" w:sz="8" w:space="0" w:color="D8DEE9"/>
-              <w:left w:val="single" w:sz="8" w:space="0" w:color="D8DEE9"/>
-              <w:bottom w:val="single" w:sz="8" w:space="0" w:color="D8DEE9"/>
-              <w:right w:val="single" w:sz="8" w:space="0" w:color="D8DEE9"/>
-            </w:tcBorders>
           </w:tcPr>
           <w:p>
-            <w:pPr>
-              <w:spacing w:after="0"/>
-            </w:pPr>
+            <w:r/>
             <w:r>
               <w:rPr>
-                <w:rFonts w:ascii="Calibri" w:hAnsi="Calibri"/>
                 <w:b w:val="0"/>
                 <w:sz w:val="18"/>
               </w:rPr>
-              <w:t>( x ) Trabalho final</w:t>
+              <w:t>Trabalho final</w:t>
             </w:r>
           </w:p>
         </w:tc>
@@ -330,51 +159,33 @@
       <w:tr>
         <w:tc>
           <w:tcPr>
-            <w:tcW w:type="dxa" w:w="2088"/>
+            <w:tcW w:type="dxa" w:w="4730"/>
             <w:vAlign w:val="center"/>
-            <w:tcBorders>
-              <w:top w:val="single" w:sz="8" w:space="0" w:color="D8DEE9"/>
-              <w:left w:val="single" w:sz="8" w:space="0" w:color="D8DEE9"/>
-              <w:bottom w:val="single" w:sz="8" w:space="0" w:color="D8DEE9"/>
-              <w:right w:val="single" w:sz="8" w:space="0" w:color="D8DEE9"/>
-            </w:tcBorders>
           </w:tcPr>
           <w:p>
-            <w:pPr>
-              <w:spacing w:after="0"/>
-            </w:pPr>
+            <w:r/>
             <w:r>
               <w:rPr>
-                <w:rFonts w:ascii="Calibri" w:hAnsi="Calibri"/>
                 <w:b w:val="0"/>
                 <w:sz w:val="18"/>
               </w:rPr>
-              <w:t>Aluno / RU</w:t>
+              <w:t>ODS</w:t>
             </w:r>
           </w:p>
         </w:tc>
         <w:tc>
           <w:tcPr>
-            <w:tcW w:type="dxa" w:w="6984"/>
+            <w:tcW w:type="dxa" w:w="4730"/>
             <w:vAlign w:val="center"/>
-            <w:tcBorders>
-              <w:top w:val="single" w:sz="8" w:space="0" w:color="D8DEE9"/>
-              <w:left w:val="single" w:sz="8" w:space="0" w:color="D8DEE9"/>
-              <w:bottom w:val="single" w:sz="8" w:space="0" w:color="D8DEE9"/>
-              <w:right w:val="single" w:sz="8" w:space="0" w:color="D8DEE9"/>
-            </w:tcBorders>
           </w:tcPr>
           <w:p>
-            <w:pPr>
-              <w:spacing w:after="0"/>
-            </w:pPr>
+            <w:r/>
             <w:r>
               <w:rPr>
-                <w:rFonts w:ascii="Calibri" w:hAnsi="Calibri"/>
                 <w:b w:val="0"/>
                 <w:sz w:val="18"/>
               </w:rPr>
-              <w:t>Leandro Andalaft dos Santos Junior - RU 4548358</w:t>
+              <w:t>03 Saúde e bem-estar; 10 Redução das desigualdades; 17 Parcerias</w:t>
             </w:r>
           </w:p>
         </w:tc>
@@ -382,301 +193,529 @@
       <w:tr>
         <w:tc>
           <w:tcPr>
-            <w:tcW w:type="dxa" w:w="2088"/>
+            <w:tcW w:type="dxa" w:w="4730"/>
             <w:vAlign w:val="center"/>
-            <w:tcBorders>
-              <w:top w:val="single" w:sz="8" w:space="0" w:color="D8DEE9"/>
-              <w:left w:val="single" w:sz="8" w:space="0" w:color="D8DEE9"/>
-              <w:bottom w:val="single" w:sz="8" w:space="0" w:color="D8DEE9"/>
-              <w:right w:val="single" w:sz="8" w:space="0" w:color="D8DEE9"/>
-            </w:tcBorders>
           </w:tcPr>
           <w:p>
-            <w:pPr>
-              <w:spacing w:after="0"/>
-            </w:pPr>
+            <w:r/>
             <w:r>
               <w:rPr>
-                <w:rFonts w:ascii="Calibri" w:hAnsi="Calibri"/>
                 <w:b w:val="0"/>
                 <w:sz w:val="18"/>
               </w:rPr>
-              <w:t>Titulo</w:t>
+              <w:t>Publicação</w:t>
             </w:r>
           </w:p>
         </w:tc>
         <w:tc>
           <w:tcPr>
-            <w:tcW w:type="dxa" w:w="6984"/>
+            <w:tcW w:type="dxa" w:w="4730"/>
             <w:vAlign w:val="center"/>
-            <w:tcBorders>
-              <w:top w:val="single" w:sz="8" w:space="0" w:color="D8DEE9"/>
-              <w:left w:val="single" w:sz="8" w:space="0" w:color="D8DEE9"/>
-              <w:bottom w:val="single" w:sz="8" w:space="0" w:color="D8DEE9"/>
-              <w:right w:val="single" w:sz="8" w:space="0" w:color="D8DEE9"/>
-            </w:tcBorders>
           </w:tcPr>
           <w:p>
-            <w:pPr>
-              <w:spacing w:after="0"/>
-            </w:pPr>
+            <w:r/>
             <w:r>
               <w:rPr>
-                <w:rFonts w:ascii="Calibri" w:hAnsi="Calibri"/>
                 <w:b w:val="0"/>
                 <w:sz w:val="18"/>
               </w:rPr>
-              <w:t>Desenvolvimento de uma ferramenta web responsiva para triagem e registro simplificado de atendimentos na Medicos do Mundo Santos e Itanhaem</w:t>
+              <w:t>https://app-medicos.vercel.app/</w:t>
+            </w:r>
+          </w:p>
+        </w:tc>
+      </w:tr>
+      <w:tr>
+        <w:tc>
+          <w:tcPr>
+            <w:tcW w:type="dxa" w:w="4730"/>
+            <w:vAlign w:val="center"/>
+          </w:tcPr>
+          <w:p>
+            <w:r/>
+            <w:r>
+              <w:rPr>
+                <w:b w:val="0"/>
+                <w:sz w:val="18"/>
+              </w:rPr>
+              <w:t>Repositório</w:t>
+            </w:r>
+          </w:p>
+        </w:tc>
+        <w:tc>
+          <w:tcPr>
+            <w:tcW w:type="dxa" w:w="4730"/>
+            <w:vAlign w:val="center"/>
+          </w:tcPr>
+          <w:p>
+            <w:r/>
+            <w:r>
+              <w:rPr>
+                <w:b w:val="0"/>
+                <w:sz w:val="18"/>
+              </w:rPr>
+              <w:t>https://github.com/Andalaftjr/app-medicos-mundo</w:t>
             </w:r>
           </w:p>
         </w:tc>
       </w:tr>
     </w:tbl>
+    <w:p/>
     <w:p>
       <w:pPr>
         <w:pStyle w:val="Heading1"/>
-        <w:spacing w:before="240" w:after="100"/>
       </w:pPr>
       <w:r>
-        <w:rPr>
-          <w:rFonts w:ascii="Calibri" w:hAnsi="Calibri"/>
-          <w:b/>
-          <w:color w:val="292F63"/>
-          <w:sz w:val="32"/>
-        </w:rPr>
-        <w:t>Setor de Aplicacao</w:t>
+        <w:t>Identificação</w:t>
       </w:r>
     </w:p>
     <w:p>
-      <w:pPr>
-        <w:spacing w:after="120" w:line="276" w:lineRule="auto"/>
-      </w:pPr>
       <w:r>
-        <w:rPr>
-          <w:rFonts w:ascii="Calibri" w:hAnsi="Calibri"/>
-          <w:b w:val="0"/>
-          <w:sz w:val="21"/>
-        </w:rPr>
-        <w:t>O projeto foi aplicado na Medicos do Mundo, organizacao da area da saude que realiza acoes humanitarias voltadas a pessoas em situacao de vulnerabilidade social. A aplicacao inicial ocorreu em Santos-SP, especialmente na regiao do Centro POP, bairro Paqueta, em articulacao com equipes voluntarias e servicos parceiros do municipio.</w:t>
+        <w:t>Curso: CST em Análise e Desenvolvimento de Sistemas.</w:t>
       </w:r>
     </w:p>
     <w:p>
-      <w:pPr>
-        <w:spacing w:after="120" w:line="276" w:lineRule="auto"/>
-      </w:pPr>
       <w:r>
-        <w:rPr>
-          <w:rFonts w:ascii="Calibri" w:hAnsi="Calibri"/>
-          <w:b w:val="0"/>
-          <w:sz w:val="21"/>
-        </w:rPr>
-        <w:t>A partir da utilizacao em Santos e da satisfacao observada entre voluntarios quanto a organizacao do fluxo, o sistema foi expandido para Itanhaem-SP, na regiao de Belas Artes. Dessa forma, a solucao passou a contemplar mais de uma localidade de acao, mantendo os prontuarios e indicadores vinculados ao local real do atendimento, e nao apenas a filial de origem do voluntario.</w:t>
+        <w:t>Disciplina: Atividade Extensionista II: Tecnologia Aplicada a Inclusão Digital - Projeto.</w:t>
       </w:r>
     </w:p>
     <w:p>
-      <w:pPr>
-        <w:spacing w:after="120" w:line="276" w:lineRule="auto"/>
-      </w:pPr>
       <w:r>
-        <w:rPr>
-          <w:rFonts w:ascii="Calibri" w:hAnsi="Calibri"/>
-          <w:b w:val="0"/>
-          <w:sz w:val="21"/>
-        </w:rPr>
-        <w:t>O ambiente de uso e externo, dinamico e sujeito a alta rotatividade de assistidos. Por isso, o sistema foi desenhado para apoiar acolhimento, cadastro, triagem, censo social, fila de espera, atendimentos multiprofissionais, registro de observacoes e exportacao posterior para consolidacao da coordenacao.</w:t>
+        <w:t>Etapa: Trabalho final.</w:t>
+      </w:r>
+    </w:p>
+    <w:p>
+      <w:r>
+        <w:t>Aluno: Leandro Andalaft dos Santos Junior.</w:t>
+      </w:r>
+    </w:p>
+    <w:p>
+      <w:r>
+        <w:t>RU: 4548358.</w:t>
       </w:r>
     </w:p>
     <w:p>
       <w:pPr>
         <w:pStyle w:val="Heading1"/>
-        <w:spacing w:before="240" w:after="100"/>
       </w:pPr>
       <w:r>
-        <w:rPr>
-          <w:rFonts w:ascii="Calibri" w:hAnsi="Calibri"/>
-          <w:b/>
-          <w:color w:val="292F63"/>
-          <w:sz w:val="32"/>
-        </w:rPr>
+        <w:t>Titulo</w:t>
+      </w:r>
+    </w:p>
+    <w:p>
+      <w:r>
+        <w:t>Desenvolvimento de uma ferramenta web responsiva para triagem, censo social, fila de atendimento e registro multiprofissional em ações da Médicos do Mundo.</w:t>
+      </w:r>
+    </w:p>
+    <w:p>
+      <w:pPr>
+        <w:pStyle w:val="Heading1"/>
+      </w:pPr>
+      <w:r>
+        <w:t>Setor de aplicação</w:t>
+      </w:r>
+    </w:p>
+    <w:p>
+      <w:r>
+        <w:t>O projeto foi aplicado na Médicos do Mundo, organização da área da saúde que realiza ações humanitarias voltadas a população em situação de vulnerabilidade social.</w:t>
+      </w:r>
+    </w:p>
+    <w:p>
+      <w:r>
+        <w:t>O primeiro ciclo de uso ocorreu em Santos-SP, especialmente na região do Centro POP, bairro Paquetá. A partir da validação em campo e da satisfação dos voluntários com a organização do fluxo, o sistema foi expandido para Itanhaém-SP, com localidade Belas Artes cadastrada como local de ação.</w:t>
+      </w:r>
+    </w:p>
+    <w:p>
+      <w:r>
+        <w:t>A instituicao atua com frente multiprofissional de cuidado, incluindo cadastro, triagem, medicina, enfermagem e curativos, odontologia, farmacia, psicologia, fisioterapia, nutricao, vacinação, biomedicina, veterinaria, podologia, justica de rua, acolhimento social, doações, apoio a mulher, emissão de documentos, beleza de rua e atendimento infantil/brinquedoteca.</w:t>
+      </w:r>
+    </w:p>
+    <w:p>
+      <w:pPr>
+        <w:pStyle w:val="Heading1"/>
+      </w:pPr>
+      <w:r>
         <w:t>Objetivos de Desenvolvimento Sustentavel</w:t>
+      </w:r>
+    </w:p>
+    <w:p>
+      <w:r>
+        <w:t>ODS 03 - Saúde e bem-estar.</w:t>
+      </w:r>
+    </w:p>
+    <w:p>
+      <w:r>
+        <w:t>ODS 10 - Redução das desigualdades.</w:t>
+      </w:r>
+    </w:p>
+    <w:p>
+      <w:r>
+        <w:t>ODS 17 - Parcerias e meios de implementação.</w:t>
+      </w:r>
+    </w:p>
+    <w:p>
+      <w:pPr>
+        <w:pStyle w:val="Heading1"/>
+      </w:pPr>
+      <w:r>
+        <w:t>Problema identificado</w:t>
+      </w:r>
+    </w:p>
+    <w:p>
+      <w:r>
+        <w:t>Antes da solução, os registros das ações eram fragmentados entre anotações, planilhas, mensagens e consolidações posteriores. Em ambiente de campo, isso dificultava acompanhar o fluxo de assistidos em tempo real, identificar pendências, priorizar casos criticos e consolidar indicadores por local da ação.</w:t>
+      </w:r>
+    </w:p>
+    <w:p>
+      <w:r>
+        <w:t>A ausencia de uma ferramenta única também aumentava o retrabalho da equipe, pois o mesmo assistido poderia ter informações repetidas ou incompletas entre triagem, censo social e atendimentos por especialidade.</w:t>
+      </w:r>
+    </w:p>
+    <w:p>
+      <w:pPr>
+        <w:pStyle w:val="Heading1"/>
+      </w:pPr>
+      <w:r>
+        <w:t>Objetivos</w:t>
       </w:r>
     </w:p>
     <w:p>
       <w:pPr>
         <w:pStyle w:val="ListBullet"/>
-        <w:spacing w:after="60" w:line="264" w:lineRule="auto"/>
       </w:pPr>
       <w:r>
-        <w:rPr>
-          <w:rFonts w:ascii="Calibri" w:hAnsi="Calibri"/>
-          <w:b w:val="0"/>
-          <w:sz w:val="20"/>
-        </w:rPr>
-        <w:t>( x ) ODS 03 - Saude e bem-estar: apoio a organizacao de atendimentos clinicos, sociais e preventivos.</w:t>
+        <w:t>Mapear o fluxo atual de acolhimento, cadastro, triagem e atendimento.</w:t>
       </w:r>
     </w:p>
     <w:p>
       <w:pPr>
         <w:pStyle w:val="ListBullet"/>
-        <w:spacing w:after="60" w:line="264" w:lineRule="auto"/>
       </w:pPr>
       <w:r>
-        <w:rPr>
-          <w:rFonts w:ascii="Calibri" w:hAnsi="Calibri"/>
-          <w:b w:val="0"/>
-          <w:sz w:val="20"/>
-        </w:rPr>
-        <w:t>( x ) ODS 10 - Reducao das desigualdades: atendimento a populacao vulneravel com registro mais estruturado e inclusivo.</w:t>
+        <w:t>Identificar gargalos operacionais no registro, consulta, fila e consolidação de dados.</w:t>
       </w:r>
     </w:p>
     <w:p>
       <w:pPr>
         <w:pStyle w:val="ListBullet"/>
-        <w:spacing w:after="60" w:line="264" w:lineRule="auto"/>
       </w:pPr>
       <w:r>
-        <w:rPr>
-          <w:rFonts w:ascii="Calibri" w:hAnsi="Calibri"/>
-          <w:b w:val="0"/>
-          <w:sz w:val="20"/>
-        </w:rPr>
-        <w:t>( x ) ODS 17 - Parcerias e meios de implementacao: integracao entre voluntarios, estudantes, profissionais, coordenacao e servicos parceiros.</w:t>
+        <w:t>Definir requisitos funcionais para uso por voluntários, acadêmicos, profissionais, coordenação e administração.</w:t>
+      </w:r>
+    </w:p>
+    <w:p>
+      <w:pPr>
+        <w:pStyle w:val="ListBullet"/>
+      </w:pPr>
+      <w:r>
+        <w:t>Desenvolver uma ferramenta simples, responsiva e segura para uso em celular ou notebook.</w:t>
+      </w:r>
+    </w:p>
+    <w:p>
+      <w:pPr>
+        <w:pStyle w:val="ListBullet"/>
+      </w:pPr>
+      <w:r>
+        <w:t>Implantar um prototipo funcional com cadastro, triagem, censo, fila, atendimento, dashboard e exportação.</w:t>
+      </w:r>
+    </w:p>
+    <w:p>
+      <w:pPr>
+        <w:pStyle w:val="ListBullet"/>
+      </w:pPr>
+      <w:r>
+        <w:t>Validar o sistema em Santos-SP e expandir para Itanhaém-SP.</w:t>
       </w:r>
     </w:p>
     <w:p>
       <w:pPr>
         <w:pStyle w:val="Heading1"/>
-        <w:spacing w:before="240" w:after="100"/>
       </w:pPr>
       <w:r>
-        <w:rPr>
-          <w:rFonts w:ascii="Calibri" w:hAnsi="Calibri"/>
-          <w:b/>
-          <w:color w:val="292F63"/>
-          <w:sz w:val="32"/>
-        </w:rPr>
-        <w:t>Objetivos</w:t>
+        <w:t>Metodologia</w:t>
       </w:r>
     </w:p>
     <w:p>
-      <w:pPr>
-        <w:pStyle w:val="ListNumber"/>
-        <w:spacing w:after="60" w:line="264" w:lineRule="auto"/>
-      </w:pPr>
       <w:r>
-        <w:rPr>
-          <w:rFonts w:ascii="Calibri" w:hAnsi="Calibri"/>
-          <w:b w:val="0"/>
-          <w:sz w:val="20"/>
-        </w:rPr>
-        <w:t>Mapear o fluxo real de cadastro, triagem e registro inicial dos atendimentos nas acoes da Medicos do Mundo.</w:t>
+        <w:t>A metodologia adotada foi aplicada, iterativa e incremental. O desenvolvimento foi conduzido por ciclos de levantamento de requisitos, prototipação funcional, validação com usuários, ajuste de interface, testes no navegador e refinamento de segurança.</w:t>
       </w:r>
     </w:p>
     <w:p>
-      <w:pPr>
-        <w:pStyle w:val="ListNumber"/>
-        <w:spacing w:after="60" w:line="264" w:lineRule="auto"/>
-      </w:pPr>
       <w:r>
-        <w:rPr>
-          <w:rFonts w:ascii="Calibri" w:hAnsi="Calibri"/>
-          <w:b w:val="0"/>
-          <w:sz w:val="20"/>
-        </w:rPr>
-        <w:t>Identificar limitacoes operacionais como lentidao no preenchimento, dificuldade de localizar assistidos, falta de padronizacao dos registros e necessidade de indicadores consolidados.</w:t>
+        <w:t>O levantamento considerou comentarios da equipe multidisciplinar, prints de validação, conversas de alinhamento, simulações com assistidos de teste e uso em campo. A cada ciclo, os formularios, alertas, textos, dashboards e fluxos de permissão foram ajustados para tornar o sistema mais intuitivo e adequado ao contexto de uma ação humanitaria.</w:t>
       </w:r>
     </w:p>
     <w:p>
-      <w:pPr>
-        <w:pStyle w:val="ListNumber"/>
-        <w:spacing w:after="60" w:line="264" w:lineRule="auto"/>
-      </w:pPr>
       <w:r>
-        <w:rPr>
-          <w:rFonts w:ascii="Calibri" w:hAnsi="Calibri"/>
-          <w:b w:val="0"/>
-          <w:sz w:val="20"/>
-        </w:rPr>
-        <w:t>Definir requisitos funcionais e regras de seguranca para uso por voluntarios, academicos, profissionais formados, coordenacao e administracao.</w:t>
-      </w:r>
-    </w:p>
-    <w:p>
-      <w:pPr>
-        <w:pStyle w:val="ListNumber"/>
-        <w:spacing w:after="60" w:line="264" w:lineRule="auto"/>
-      </w:pPr>
-      <w:r>
-        <w:rPr>
-          <w:rFonts w:ascii="Calibri" w:hAnsi="Calibri"/>
-          <w:b w:val="0"/>
-          <w:sz w:val="20"/>
-        </w:rPr>
-        <w:t>Desenvolver uma ferramenta web responsiva capaz de funcionar em celular ou notebook, com fluxo simples para uso em campo.</w:t>
-      </w:r>
-    </w:p>
-    <w:p>
-      <w:pPr>
-        <w:pStyle w:val="ListNumber"/>
-        <w:spacing w:after="60" w:line="264" w:lineRule="auto"/>
-      </w:pPr>
-      <w:r>
-        <w:rPr>
-          <w:rFonts w:ascii="Calibri" w:hAnsi="Calibri"/>
-          <w:b w:val="0"/>
-          <w:sz w:val="20"/>
-        </w:rPr>
-        <w:t>Implantar e validar um prototipo funcional que cadastre assistidos, registre triagem e atendimentos, organize fila de espera, apresente dashboards e permita exportacao estruturada de dados.</w:t>
+        <w:t>A validação ocorreu por meio de cadastros, triagens, censos, atendimentos completos e parciais, atendimento extra, dashboard por local da ação e exportação de dados.</w:t>
       </w:r>
     </w:p>
     <w:p>
       <w:pPr>
         <w:pStyle w:val="Heading1"/>
-        <w:spacing w:before="240" w:after="100"/>
       </w:pPr>
       <w:r>
-        <w:rPr>
-          <w:rFonts w:ascii="Calibri" w:hAnsi="Calibri"/>
-          <w:b/>
-          <w:color w:val="292F63"/>
-          <w:sz w:val="32"/>
-        </w:rPr>
-        <w:t>Metodologia</w:t>
+        <w:t>Tecnologias utilizadas</w:t>
       </w:r>
     </w:p>
     <w:p>
       <w:pPr>
-        <w:spacing w:after="120" w:line="276" w:lineRule="auto"/>
+        <w:pStyle w:val="ListBullet"/>
       </w:pPr>
       <w:r>
-        <w:rPr>
-          <w:rFonts w:ascii="Calibri" w:hAnsi="Calibri"/>
-          <w:b w:val="0"/>
-          <w:sz w:val="21"/>
-        </w:rPr>
-        <w:t>A metodologia adotada combinou Engenharia de Requisitos, prototipacao iterativa e validacao em campo. O trabalho seguiu uma abordagem incremental, adequada ao prazo da Atividade Extensionista II e ao ambiente real da acao, onde as necessidades surgem rapidamente durante o uso.</w:t>
+        <w:t>Frontend: React, Vite, Tailwind CSS e Lucide React.</w:t>
       </w:r>
     </w:p>
     <w:p>
       <w:pPr>
-        <w:spacing w:after="120" w:line="276" w:lineRule="auto"/>
+        <w:pStyle w:val="ListBullet"/>
       </w:pPr>
       <w:r>
-        <w:rPr>
-          <w:rFonts w:ascii="Calibri" w:hAnsi="Calibri"/>
-          <w:b w:val="0"/>
-          <w:sz w:val="21"/>
-        </w:rPr>
-        <w:t>O levantamento inicial foi realizado por observacao do processo, analise de comentarios dos voluntarios, conversas sobre dores operacionais e avaliacao dos pontos em que o atendimento ficava confuso ou lento. A partir disso, foram priorizados requisitos de baixo atrito: cadastro rapido, triagem orientada, fila visivel, registro por area, alertas clinico-sociais e exportacao para coordenacao.</w:t>
+        <w:t>Backend: Firebase Authentication, Cloud Firestore, Firebase Storage e Cloud Functions.</w:t>
       </w:r>
     </w:p>
     <w:p>
       <w:pPr>
-        <w:jc w:val="center"/>
+        <w:pStyle w:val="ListBullet"/>
       </w:pPr>
+      <w:r>
+        <w:t>Segurança: Firestore Security Rules, validação de e-mail, perfis de acesso e separação por local da ação.</w:t>
+      </w:r>
+    </w:p>
+    <w:p>
+      <w:pPr>
+        <w:pStyle w:val="ListBullet"/>
+      </w:pPr>
+      <w:r>
+        <w:t>Exportação: biblioteca write-excel-file para planilhas com dashboards e abas por área.</w:t>
+      </w:r>
+    </w:p>
+    <w:p>
+      <w:pPr>
+        <w:pStyle w:val="ListBullet"/>
+      </w:pPr>
+      <w:r>
+        <w:t>Publicação e metricas: Vercel, Vercel Analytics e Vercel Speed Insights.</w:t>
+      </w:r>
+    </w:p>
+    <w:p>
+      <w:pPr>
+        <w:pStyle w:val="ListBullet"/>
+      </w:pPr>
+      <w:r>
+        <w:t>Qualidade: ESLint, build Vite e testes funcionais no navegador.</w:t>
+      </w:r>
+    </w:p>
+    <w:p>
+      <w:pPr>
+        <w:pStyle w:val="Heading1"/>
+      </w:pPr>
+      <w:r>
+        <w:t>Funcionalidades implementadas</w:t>
+      </w:r>
+    </w:p>
+    <w:p>
+      <w:pPr>
+        <w:pStyle w:val="ListBullet"/>
+      </w:pPr>
+      <w:r>
+        <w:t>Login com perfis operacionais e acesso protegido.</w:t>
+      </w:r>
+    </w:p>
+    <w:p>
+      <w:pPr>
+        <w:pStyle w:val="ListBullet"/>
+      </w:pPr>
+      <w:r>
+        <w:t>Seleção obrigatória do local da ação antes do uso operacional.</w:t>
+      </w:r>
+    </w:p>
+    <w:p>
+      <w:pPr>
+        <w:pStyle w:val="ListBullet"/>
+      </w:pPr>
+      <w:r>
+        <w:t>Cadastro de assistidos com identificação, nome civil/social, sexo ao nascer, gênero e dados sociais.</w:t>
+      </w:r>
+    </w:p>
+    <w:p>
+      <w:pPr>
+        <w:pStyle w:val="ListBullet"/>
+      </w:pPr>
+      <w:r>
+        <w:t>Triagem com queixa principal, uso de medicação, sinais vitais, IMC, prioridade, atenção inclusiva e encaminhamentos.</w:t>
+      </w:r>
+    </w:p>
+    <w:p>
+      <w:pPr>
+        <w:pStyle w:val="ListBullet"/>
+      </w:pPr>
+      <w:r>
+        <w:t>Censo social com moradia, rede de apoio, trabalho, uso de substancias, saúde sexual/reprodutiva, antecedentes clínicos, saúde mental, segurança alimentar e pets.</w:t>
+      </w:r>
+    </w:p>
+    <w:p>
+      <w:pPr>
+        <w:pStyle w:val="ListBullet"/>
+      </w:pPr>
+      <w:r>
+        <w:t>Fila de atendimento com indicação de aguardando ação, finalizados e prioridade.</w:t>
+      </w:r>
+    </w:p>
+    <w:p>
+      <w:pPr>
+        <w:pStyle w:val="ListBullet"/>
+      </w:pPr>
+      <w:r>
+        <w:t>Atendimento extra para situações que não devem aguardar o fluxo completo.</w:t>
+      </w:r>
+    </w:p>
+    <w:p>
+      <w:pPr>
+        <w:pStyle w:val="ListBullet"/>
+      </w:pPr>
+      <w:r>
+        <w:t>Prontuário com histórico e registros por área.</w:t>
+      </w:r>
+    </w:p>
+    <w:p>
+      <w:pPr>
+        <w:pStyle w:val="ListBullet"/>
+      </w:pPr>
+      <w:r>
+        <w:t>Dashboards gerais e por área, com exportação geral e por data para coordenação/administração.</w:t>
+      </w:r>
+    </w:p>
+    <w:p>
+      <w:pPr>
+        <w:pStyle w:val="Heading1"/>
+      </w:pPr>
+      <w:r>
+        <w:t>Resultados esperados e obtidos</w:t>
+      </w:r>
+    </w:p>
+    <w:p>
+      <w:r>
+        <w:t>O sistema foi aplicado inicialmente em Santos-SP e permitiu organizar melhor o fluxo de assistidos durante as ações. A equipe passou a visualizar registros de triagem, censo social, atendimentos e pendências de forma mais clara.</w:t>
+      </w:r>
+    </w:p>
+    <w:p>
+      <w:r>
+        <w:t>Com a aceitação em Santos-SP, o projeto foi expandido para Itanhaém-SP. A solução passou a contemplar múltiplos locais de ação, mantendo indicadores e prontuários vinculados ao local onde o atendimento ocorreu.</w:t>
+      </w:r>
+    </w:p>
+    <w:p>
+      <w:r>
+        <w:t>Como resultados, foram obtidos centralização das informações, redução de retrabalho, apoio a priorização de casos, dashboards operacionais, exportação estruturada e documentação academica com evidências sanitizadas.</w:t>
+      </w:r>
+    </w:p>
+    <w:p>
+      <w:pPr>
+        <w:pStyle w:val="Heading1"/>
+      </w:pPr>
+      <w:r>
+        <w:t>LGPD e segurança</w:t>
+      </w:r>
+    </w:p>
+    <w:p>
+      <w:pPr>
+        <w:pStyle w:val="ListBullet"/>
+      </w:pPr>
+      <w:r>
+        <w:t>O repositório não publica dados pessoais de assistidos ou voluntários. As evidências foram sanitizadas antes de serem incluidas na documentação.</w:t>
+      </w:r>
+    </w:p>
+    <w:p>
+      <w:pPr>
+        <w:pStyle w:val="ListBullet"/>
+      </w:pPr>
+      <w:r>
+        <w:t>O sistema possui autenticação, regras de segurança, perfis de acesso e cuidado para que exportações sensiveis sejam restritas a coordenação e administração.</w:t>
+      </w:r>
+    </w:p>
+    <w:p>
+      <w:pPr>
+        <w:pStyle w:val="Heading1"/>
+      </w:pPr>
+      <w:r>
+        <w:t>Publicação e execução</w:t>
+      </w:r>
+    </w:p>
+    <w:p>
+      <w:pPr>
+        <w:pStyle w:val="ListBullet"/>
+      </w:pPr>
+      <w:r>
+        <w:t>Versão publicada: https://app-medicos.vercel.app/.</w:t>
+      </w:r>
+    </w:p>
+    <w:p>
+      <w:pPr>
+        <w:pStyle w:val="ListBullet"/>
+      </w:pPr>
+      <w:r>
+        <w:t>Repositório: https://github.com/Andalaftjr/app-medicos-mundo.</w:t>
+      </w:r>
+    </w:p>
+    <w:p>
+      <w:pPr>
+        <w:pStyle w:val="ListBullet"/>
+      </w:pPr>
+      <w:r>
+        <w:t>Execução local: instalar dependências com npm install, criar arquivo .env a partir de .env.example e executar npm run dev.</w:t>
+      </w:r>
+    </w:p>
+    <w:p>
+      <w:pPr>
+        <w:pStyle w:val="ListBullet"/>
+      </w:pPr>
+      <w:r>
+        <w:t>Validação: npm run lint e npm run build.</w:t>
+      </w:r>
+    </w:p>
+    <w:p>
+      <w:pPr>
+        <w:pStyle w:val="Heading1"/>
+      </w:pPr>
+      <w:r>
+        <w:t>Considerações finais</w:t>
+      </w:r>
+    </w:p>
+    <w:p>
+      <w:r>
+        <w:t>A atividade extensionista resultou em uma solução funcional, aplicada e documentada, com impacto direto na organização operacional das ações da Médicos do Mundo.</w:t>
+      </w:r>
+    </w:p>
+    <w:p>
+      <w:r>
+        <w:t>O projeto demonstra a aplicação pratica de tecnologia para inclusão digital e apoio a saúde, conectando desenvolvimento de software, segurança de dados, experiencia do usuario e responsabilidade social.</w:t>
+      </w:r>
+    </w:p>
+    <w:p>
+      <w:r>
+        <w:br w:type="page"/>
+      </w:r>
+    </w:p>
+    <w:p>
+      <w:pPr>
+        <w:pStyle w:val="Heading1"/>
+      </w:pPr>
+      <w:r>
+        <w:t>Diagramas do projeto</w:t>
+      </w:r>
+    </w:p>
+    <w:p>
+      <w:pPr>
+        <w:pStyle w:val="Heading2"/>
+      </w:pPr>
+      <w:r>
+        <w:t>Diagrama de contexto: participantes, sistema, Firebase e exportações.</w:t>
+      </w:r>
+    </w:p>
+    <w:p>
       <w:r>
         <w:drawing>
           <wp:inline xmlns:a="http://schemas.openxmlformats.org/drawingml/2006/main" xmlns:pic="http://schemas.openxmlformats.org/drawingml/2006/picture">
-            <wp:extent cx="5669280" cy="3259836"/>
+            <wp:extent cx="5577840" cy="3027970"/>
             <wp:docPr id="1" name="Picture 1"/>
             <wp:cNvGraphicFramePr>
               <a:graphicFrameLocks noChangeAspect="1"/>
@@ -685,7 +724,7 @@
               <a:graphicData uri="http://schemas.openxmlformats.org/drawingml/2006/picture">
                 <pic:pic>
                   <pic:nvPicPr>
-                    <pic:cNvPr id="0" name="diagrama-metodologia.png"/>
+                    <pic:cNvPr id="0" name="diagrama-contexto.png"/>
                     <pic:cNvPicPr/>
                   </pic:nvPicPr>
                   <pic:blipFill>
@@ -697,7 +736,7 @@
                   <pic:spPr>
                     <a:xfrm>
                       <a:off x="0" y="0"/>
-                      <a:ext cx="5669280" cy="3259836"/>
+                      <a:ext cx="5577840" cy="3027970"/>
                     </a:xfrm>
                     <a:prstGeom prst="rect"/>
                   </pic:spPr>
@@ -710,1234 +749,17 @@
     </w:p>
     <w:p>
       <w:pPr>
-        <w:spacing w:after="140"/>
-        <w:jc w:val="center"/>
+        <w:pStyle w:val="Heading2"/>
       </w:pPr>
       <w:r>
-        <w:rPr>
-          <w:rFonts w:ascii="Calibri" w:hAnsi="Calibri"/>
-          <w:b/>
-          <w:color w:val="596379"/>
-          <w:sz w:val="17"/>
-        </w:rPr>
-        <w:t>Figura 1 - Fluxo metodologico do projeto extensionista.</w:t>
+        <w:t>Fluxo operacional: da entrada no app ate dashboards e exportação.</w:t>
       </w:r>
     </w:p>
-    <w:tbl>
-      <w:tblPr>
-        <w:tblW w:type="auto" w:w="0"/>
-        <w:jc w:val="center"/>
-        <w:tblLayout w:type="fixed"/>
-        <w:tblLook w:firstColumn="1" w:firstRow="1" w:lastColumn="0" w:lastRow="0" w:noHBand="0" w:noVBand="1" w:val="04A0"/>
-      </w:tblPr>
-      <w:tblGrid>
-        <w:gridCol w:w="2484"/>
-        <w:gridCol w:w="2484"/>
-        <w:gridCol w:w="2484"/>
-        <w:gridCol w:w="2484"/>
-      </w:tblGrid>
-      <w:tr>
-        <w:tc>
-          <w:tcPr>
-            <w:tcW w:type="dxa" w:w="1440"/>
-            <w:vAlign w:val="center"/>
-            <w:shd w:fill="EAF1FF"/>
-            <w:tcBorders>
-              <w:top w:val="single" w:sz="8" w:space="0" w:color="D8DEE9"/>
-              <w:left w:val="single" w:sz="8" w:space="0" w:color="D8DEE9"/>
-              <w:bottom w:val="single" w:sz="8" w:space="0" w:color="D8DEE9"/>
-              <w:right w:val="single" w:sz="8" w:space="0" w:color="D8DEE9"/>
-            </w:tcBorders>
-          </w:tcPr>
-          <w:p>
-            <w:pPr>
-              <w:jc w:val="center"/>
-            </w:pPr>
-            <w:r>
-              <w:rPr>
-                <w:rFonts w:ascii="Calibri" w:hAnsi="Calibri"/>
-                <w:b/>
-                <w:color w:val="292F63"/>
-                <w:sz w:val="18"/>
-              </w:rPr>
-              <w:t>Etapa</w:t>
-            </w:r>
-          </w:p>
-        </w:tc>
-        <w:tc>
-          <w:tcPr>
-            <w:tcW w:type="dxa" w:w="1440"/>
-            <w:vAlign w:val="center"/>
-            <w:shd w:fill="EAF1FF"/>
-            <w:tcBorders>
-              <w:top w:val="single" w:sz="8" w:space="0" w:color="D8DEE9"/>
-              <w:left w:val="single" w:sz="8" w:space="0" w:color="D8DEE9"/>
-              <w:bottom w:val="single" w:sz="8" w:space="0" w:color="D8DEE9"/>
-              <w:right w:val="single" w:sz="8" w:space="0" w:color="D8DEE9"/>
-            </w:tcBorders>
-          </w:tcPr>
-          <w:p>
-            <w:pPr>
-              <w:jc w:val="center"/>
-            </w:pPr>
-            <w:r>
-              <w:rPr>
-                <w:rFonts w:ascii="Calibri" w:hAnsi="Calibri"/>
-                <w:b/>
-                <w:color w:val="292F63"/>
-                <w:sz w:val="18"/>
-              </w:rPr>
-              <w:t>Duracao estimada</w:t>
-            </w:r>
-          </w:p>
-        </w:tc>
-        <w:tc>
-          <w:tcPr>
-            <w:tcW w:type="dxa" w:w="4320"/>
-            <w:vAlign w:val="center"/>
-            <w:shd w:fill="EAF1FF"/>
-            <w:tcBorders>
-              <w:top w:val="single" w:sz="8" w:space="0" w:color="D8DEE9"/>
-              <w:left w:val="single" w:sz="8" w:space="0" w:color="D8DEE9"/>
-              <w:bottom w:val="single" w:sz="8" w:space="0" w:color="D8DEE9"/>
-              <w:right w:val="single" w:sz="8" w:space="0" w:color="D8DEE9"/>
-            </w:tcBorders>
-          </w:tcPr>
-          <w:p>
-            <w:pPr>
-              <w:jc w:val="center"/>
-            </w:pPr>
-            <w:r>
-              <w:rPr>
-                <w:rFonts w:ascii="Calibri" w:hAnsi="Calibri"/>
-                <w:b/>
-                <w:color w:val="292F63"/>
-                <w:sz w:val="18"/>
-              </w:rPr>
-              <w:t>Atividades realizadas</w:t>
-            </w:r>
-          </w:p>
-        </w:tc>
-        <w:tc>
-          <w:tcPr>
-            <w:tcW w:type="dxa" w:w="1872"/>
-            <w:vAlign w:val="center"/>
-            <w:shd w:fill="EAF1FF"/>
-            <w:tcBorders>
-              <w:top w:val="single" w:sz="8" w:space="0" w:color="D8DEE9"/>
-              <w:left w:val="single" w:sz="8" w:space="0" w:color="D8DEE9"/>
-              <w:bottom w:val="single" w:sz="8" w:space="0" w:color="D8DEE9"/>
-              <w:right w:val="single" w:sz="8" w:space="0" w:color="D8DEE9"/>
-            </w:tcBorders>
-          </w:tcPr>
-          <w:p>
-            <w:pPr>
-              <w:jc w:val="center"/>
-            </w:pPr>
-            <w:r>
-              <w:rPr>
-                <w:rFonts w:ascii="Calibri" w:hAnsi="Calibri"/>
-                <w:b/>
-                <w:color w:val="292F63"/>
-                <w:sz w:val="18"/>
-              </w:rPr>
-              <w:t>Evidencia</w:t>
-            </w:r>
-          </w:p>
-        </w:tc>
-      </w:tr>
-      <w:tr>
-        <w:tc>
-          <w:tcPr>
-            <w:tcW w:type="dxa" w:w="1440"/>
-            <w:vAlign w:val="center"/>
-            <w:tcBorders>
-              <w:top w:val="single" w:sz="8" w:space="0" w:color="D8DEE9"/>
-              <w:left w:val="single" w:sz="8" w:space="0" w:color="D8DEE9"/>
-              <w:bottom w:val="single" w:sz="8" w:space="0" w:color="D8DEE9"/>
-              <w:right w:val="single" w:sz="8" w:space="0" w:color="D8DEE9"/>
-            </w:tcBorders>
-          </w:tcPr>
-          <w:p>
-            <w:pPr>
-              <w:spacing w:after="0"/>
-            </w:pPr>
-            <w:r>
-              <w:rPr>
-                <w:rFonts w:ascii="Calibri" w:hAnsi="Calibri"/>
-                <w:b w:val="0"/>
-                <w:sz w:val="18"/>
-              </w:rPr>
-              <w:t>Diagnostico</w:t>
-            </w:r>
-          </w:p>
-        </w:tc>
-        <w:tc>
-          <w:tcPr>
-            <w:tcW w:type="dxa" w:w="1440"/>
-            <w:vAlign w:val="center"/>
-            <w:tcBorders>
-              <w:top w:val="single" w:sz="8" w:space="0" w:color="D8DEE9"/>
-              <w:left w:val="single" w:sz="8" w:space="0" w:color="D8DEE9"/>
-              <w:bottom w:val="single" w:sz="8" w:space="0" w:color="D8DEE9"/>
-              <w:right w:val="single" w:sz="8" w:space="0" w:color="D8DEE9"/>
-            </w:tcBorders>
-          </w:tcPr>
-          <w:p>
-            <w:pPr>
-              <w:spacing w:after="0"/>
-            </w:pPr>
-            <w:r>
-              <w:rPr>
-                <w:rFonts w:ascii="Calibri" w:hAnsi="Calibri"/>
-                <w:b w:val="0"/>
-                <w:sz w:val="18"/>
-              </w:rPr>
-              <w:t>7 dias</w:t>
-            </w:r>
-          </w:p>
-        </w:tc>
-        <w:tc>
-          <w:tcPr>
-            <w:tcW w:type="dxa" w:w="4320"/>
-            <w:vAlign w:val="center"/>
-            <w:tcBorders>
-              <w:top w:val="single" w:sz="8" w:space="0" w:color="D8DEE9"/>
-              <w:left w:val="single" w:sz="8" w:space="0" w:color="D8DEE9"/>
-              <w:bottom w:val="single" w:sz="8" w:space="0" w:color="D8DEE9"/>
-              <w:right w:val="single" w:sz="8" w:space="0" w:color="D8DEE9"/>
-            </w:tcBorders>
-          </w:tcPr>
-          <w:p>
-            <w:pPr>
-              <w:spacing w:after="0"/>
-            </w:pPr>
-            <w:r>
-              <w:rPr>
-                <w:rFonts w:ascii="Calibri" w:hAnsi="Calibri"/>
-                <w:b w:val="0"/>
-                <w:sz w:val="18"/>
-              </w:rPr>
-              <w:t>Observacao do fluxo, leitura de comentarios e identificacao das dificuldades.</w:t>
-            </w:r>
-          </w:p>
-        </w:tc>
-        <w:tc>
-          <w:tcPr>
-            <w:tcW w:type="dxa" w:w="1872"/>
-            <w:vAlign w:val="center"/>
-            <w:tcBorders>
-              <w:top w:val="single" w:sz="8" w:space="0" w:color="D8DEE9"/>
-              <w:left w:val="single" w:sz="8" w:space="0" w:color="D8DEE9"/>
-              <w:bottom w:val="single" w:sz="8" w:space="0" w:color="D8DEE9"/>
-              <w:right w:val="single" w:sz="8" w:space="0" w:color="D8DEE9"/>
-            </w:tcBorders>
-          </w:tcPr>
-          <w:p>
-            <w:pPr>
-              <w:spacing w:after="0"/>
-            </w:pPr>
-            <w:r>
-              <w:rPr>
-                <w:rFonts w:ascii="Calibri" w:hAnsi="Calibri"/>
-                <w:b w:val="0"/>
-                <w:sz w:val="18"/>
-              </w:rPr>
-              <w:t>Lista de requisitos e registros de feedback.</w:t>
-            </w:r>
-          </w:p>
-        </w:tc>
-      </w:tr>
-      <w:tr>
-        <w:tc>
-          <w:tcPr>
-            <w:tcW w:type="dxa" w:w="1440"/>
-            <w:vAlign w:val="center"/>
-            <w:tcBorders>
-              <w:top w:val="single" w:sz="8" w:space="0" w:color="D8DEE9"/>
-              <w:left w:val="single" w:sz="8" w:space="0" w:color="D8DEE9"/>
-              <w:bottom w:val="single" w:sz="8" w:space="0" w:color="D8DEE9"/>
-              <w:right w:val="single" w:sz="8" w:space="0" w:color="D8DEE9"/>
-            </w:tcBorders>
-          </w:tcPr>
-          <w:p>
-            <w:pPr>
-              <w:spacing w:after="0"/>
-            </w:pPr>
-            <w:r>
-              <w:rPr>
-                <w:rFonts w:ascii="Calibri" w:hAnsi="Calibri"/>
-                <w:b w:val="0"/>
-                <w:sz w:val="18"/>
-              </w:rPr>
-              <w:t>Projeto</w:t>
-            </w:r>
-          </w:p>
-        </w:tc>
-        <w:tc>
-          <w:tcPr>
-            <w:tcW w:type="dxa" w:w="1440"/>
-            <w:vAlign w:val="center"/>
-            <w:tcBorders>
-              <w:top w:val="single" w:sz="8" w:space="0" w:color="D8DEE9"/>
-              <w:left w:val="single" w:sz="8" w:space="0" w:color="D8DEE9"/>
-              <w:bottom w:val="single" w:sz="8" w:space="0" w:color="D8DEE9"/>
-              <w:right w:val="single" w:sz="8" w:space="0" w:color="D8DEE9"/>
-            </w:tcBorders>
-          </w:tcPr>
-          <w:p>
-            <w:pPr>
-              <w:spacing w:after="0"/>
-            </w:pPr>
-            <w:r>
-              <w:rPr>
-                <w:rFonts w:ascii="Calibri" w:hAnsi="Calibri"/>
-                <w:b w:val="0"/>
-                <w:sz w:val="18"/>
-              </w:rPr>
-              <w:t>10 dias</w:t>
-            </w:r>
-          </w:p>
-        </w:tc>
-        <w:tc>
-          <w:tcPr>
-            <w:tcW w:type="dxa" w:w="4320"/>
-            <w:vAlign w:val="center"/>
-            <w:tcBorders>
-              <w:top w:val="single" w:sz="8" w:space="0" w:color="D8DEE9"/>
-              <w:left w:val="single" w:sz="8" w:space="0" w:color="D8DEE9"/>
-              <w:bottom w:val="single" w:sz="8" w:space="0" w:color="D8DEE9"/>
-              <w:right w:val="single" w:sz="8" w:space="0" w:color="D8DEE9"/>
-            </w:tcBorders>
-          </w:tcPr>
-          <w:p>
-            <w:pPr>
-              <w:spacing w:after="0"/>
-            </w:pPr>
-            <w:r>
-              <w:rPr>
-                <w:rFonts w:ascii="Calibri" w:hAnsi="Calibri"/>
-                <w:b w:val="0"/>
-                <w:sz w:val="18"/>
-              </w:rPr>
-              <w:t>Modelagem dos fluxos, definicao de entidades, regras de acesso e telas prioritarias.</w:t>
-            </w:r>
-          </w:p>
-        </w:tc>
-        <w:tc>
-          <w:tcPr>
-            <w:tcW w:type="dxa" w:w="1872"/>
-            <w:vAlign w:val="center"/>
-            <w:tcBorders>
-              <w:top w:val="single" w:sz="8" w:space="0" w:color="D8DEE9"/>
-              <w:left w:val="single" w:sz="8" w:space="0" w:color="D8DEE9"/>
-              <w:bottom w:val="single" w:sz="8" w:space="0" w:color="D8DEE9"/>
-              <w:right w:val="single" w:sz="8" w:space="0" w:color="D8DEE9"/>
-            </w:tcBorders>
-          </w:tcPr>
-          <w:p>
-            <w:pPr>
-              <w:spacing w:after="0"/>
-            </w:pPr>
-            <w:r>
-              <w:rPr>
-                <w:rFonts w:ascii="Calibri" w:hAnsi="Calibri"/>
-                <w:b w:val="0"/>
-                <w:sz w:val="18"/>
-              </w:rPr>
-              <w:t>Diagramas e checklist funcional.</w:t>
-            </w:r>
-          </w:p>
-        </w:tc>
-      </w:tr>
-      <w:tr>
-        <w:tc>
-          <w:tcPr>
-            <w:tcW w:type="dxa" w:w="1440"/>
-            <w:vAlign w:val="center"/>
-            <w:tcBorders>
-              <w:top w:val="single" w:sz="8" w:space="0" w:color="D8DEE9"/>
-              <w:left w:val="single" w:sz="8" w:space="0" w:color="D8DEE9"/>
-              <w:bottom w:val="single" w:sz="8" w:space="0" w:color="D8DEE9"/>
-              <w:right w:val="single" w:sz="8" w:space="0" w:color="D8DEE9"/>
-            </w:tcBorders>
-          </w:tcPr>
-          <w:p>
-            <w:pPr>
-              <w:spacing w:after="0"/>
-            </w:pPr>
-            <w:r>
-              <w:rPr>
-                <w:rFonts w:ascii="Calibri" w:hAnsi="Calibri"/>
-                <w:b w:val="0"/>
-                <w:sz w:val="18"/>
-              </w:rPr>
-              <w:t>Desenvolvimento</w:t>
-            </w:r>
-          </w:p>
-        </w:tc>
-        <w:tc>
-          <w:tcPr>
-            <w:tcW w:type="dxa" w:w="1440"/>
-            <w:vAlign w:val="center"/>
-            <w:tcBorders>
-              <w:top w:val="single" w:sz="8" w:space="0" w:color="D8DEE9"/>
-              <w:left w:val="single" w:sz="8" w:space="0" w:color="D8DEE9"/>
-              <w:bottom w:val="single" w:sz="8" w:space="0" w:color="D8DEE9"/>
-              <w:right w:val="single" w:sz="8" w:space="0" w:color="D8DEE9"/>
-            </w:tcBorders>
-          </w:tcPr>
-          <w:p>
-            <w:pPr>
-              <w:spacing w:after="0"/>
-            </w:pPr>
-            <w:r>
-              <w:rPr>
-                <w:rFonts w:ascii="Calibri" w:hAnsi="Calibri"/>
-                <w:b w:val="0"/>
-                <w:sz w:val="18"/>
-              </w:rPr>
-              <w:t>25 dias</w:t>
-            </w:r>
-          </w:p>
-        </w:tc>
-        <w:tc>
-          <w:tcPr>
-            <w:tcW w:type="dxa" w:w="4320"/>
-            <w:vAlign w:val="center"/>
-            <w:tcBorders>
-              <w:top w:val="single" w:sz="8" w:space="0" w:color="D8DEE9"/>
-              <w:left w:val="single" w:sz="8" w:space="0" w:color="D8DEE9"/>
-              <w:bottom w:val="single" w:sz="8" w:space="0" w:color="D8DEE9"/>
-              <w:right w:val="single" w:sz="8" w:space="0" w:color="D8DEE9"/>
-            </w:tcBorders>
-          </w:tcPr>
-          <w:p>
-            <w:pPr>
-              <w:spacing w:after="0"/>
-            </w:pPr>
-            <w:r>
-              <w:rPr>
-                <w:rFonts w:ascii="Calibri" w:hAnsi="Calibri"/>
-                <w:b w:val="0"/>
-                <w:sz w:val="18"/>
-              </w:rPr>
-              <w:t>Implementacao em React/Firebase, ajustes de formularios, fila, dashboards e Excel.</w:t>
-            </w:r>
-          </w:p>
-        </w:tc>
-        <w:tc>
-          <w:tcPr>
-            <w:tcW w:type="dxa" w:w="1872"/>
-            <w:vAlign w:val="center"/>
-            <w:tcBorders>
-              <w:top w:val="single" w:sz="8" w:space="0" w:color="D8DEE9"/>
-              <w:left w:val="single" w:sz="8" w:space="0" w:color="D8DEE9"/>
-              <w:bottom w:val="single" w:sz="8" w:space="0" w:color="D8DEE9"/>
-              <w:right w:val="single" w:sz="8" w:space="0" w:color="D8DEE9"/>
-            </w:tcBorders>
-          </w:tcPr>
-          <w:p>
-            <w:pPr>
-              <w:spacing w:after="0"/>
-            </w:pPr>
-            <w:r>
-              <w:rPr>
-                <w:rFonts w:ascii="Calibri" w:hAnsi="Calibri"/>
-                <w:b w:val="0"/>
-                <w:sz w:val="18"/>
-              </w:rPr>
-              <w:t>Commits, build e versao publicada.</w:t>
-            </w:r>
-          </w:p>
-        </w:tc>
-      </w:tr>
-      <w:tr>
-        <w:tc>
-          <w:tcPr>
-            <w:tcW w:type="dxa" w:w="1440"/>
-            <w:vAlign w:val="center"/>
-            <w:tcBorders>
-              <w:top w:val="single" w:sz="8" w:space="0" w:color="D8DEE9"/>
-              <w:left w:val="single" w:sz="8" w:space="0" w:color="D8DEE9"/>
-              <w:bottom w:val="single" w:sz="8" w:space="0" w:color="D8DEE9"/>
-              <w:right w:val="single" w:sz="8" w:space="0" w:color="D8DEE9"/>
-            </w:tcBorders>
-          </w:tcPr>
-          <w:p>
-            <w:pPr>
-              <w:spacing w:after="0"/>
-            </w:pPr>
-            <w:r>
-              <w:rPr>
-                <w:rFonts w:ascii="Calibri" w:hAnsi="Calibri"/>
-                <w:b w:val="0"/>
-                <w:sz w:val="18"/>
-              </w:rPr>
-              <w:t>Validacao em Santos</w:t>
-            </w:r>
-          </w:p>
-        </w:tc>
-        <w:tc>
-          <w:tcPr>
-            <w:tcW w:type="dxa" w:w="1440"/>
-            <w:vAlign w:val="center"/>
-            <w:tcBorders>
-              <w:top w:val="single" w:sz="8" w:space="0" w:color="D8DEE9"/>
-              <w:left w:val="single" w:sz="8" w:space="0" w:color="D8DEE9"/>
-              <w:bottom w:val="single" w:sz="8" w:space="0" w:color="D8DEE9"/>
-              <w:right w:val="single" w:sz="8" w:space="0" w:color="D8DEE9"/>
-            </w:tcBorders>
-          </w:tcPr>
-          <w:p>
-            <w:pPr>
-              <w:spacing w:after="0"/>
-            </w:pPr>
-            <w:r>
-              <w:rPr>
-                <w:rFonts w:ascii="Calibri" w:hAnsi="Calibri"/>
-                <w:b w:val="0"/>
-                <w:sz w:val="18"/>
-              </w:rPr>
-              <w:t>Acao presencial</w:t>
-            </w:r>
-          </w:p>
-        </w:tc>
-        <w:tc>
-          <w:tcPr>
-            <w:tcW w:type="dxa" w:w="4320"/>
-            <w:vAlign w:val="center"/>
-            <w:tcBorders>
-              <w:top w:val="single" w:sz="8" w:space="0" w:color="D8DEE9"/>
-              <w:left w:val="single" w:sz="8" w:space="0" w:color="D8DEE9"/>
-              <w:bottom w:val="single" w:sz="8" w:space="0" w:color="D8DEE9"/>
-              <w:right w:val="single" w:sz="8" w:space="0" w:color="D8DEE9"/>
-            </w:tcBorders>
-          </w:tcPr>
-          <w:p>
-            <w:pPr>
-              <w:spacing w:after="0"/>
-            </w:pPr>
-            <w:r>
-              <w:rPr>
-                <w:rFonts w:ascii="Calibri" w:hAnsi="Calibri"/>
-                <w:b w:val="0"/>
-                <w:sz w:val="18"/>
-              </w:rPr>
-              <w:t>Uso com cadastros, triagens, atendimentos e ajustes de experiencia.</w:t>
-            </w:r>
-          </w:p>
-        </w:tc>
-        <w:tc>
-          <w:tcPr>
-            <w:tcW w:type="dxa" w:w="1872"/>
-            <w:vAlign w:val="center"/>
-            <w:tcBorders>
-              <w:top w:val="single" w:sz="8" w:space="0" w:color="D8DEE9"/>
-              <w:left w:val="single" w:sz="8" w:space="0" w:color="D8DEE9"/>
-              <w:bottom w:val="single" w:sz="8" w:space="0" w:color="D8DEE9"/>
-              <w:right w:val="single" w:sz="8" w:space="0" w:color="D8DEE9"/>
-            </w:tcBorders>
-          </w:tcPr>
-          <w:p>
-            <w:pPr>
-              <w:spacing w:after="0"/>
-            </w:pPr>
-            <w:r>
-              <w:rPr>
-                <w:rFonts w:ascii="Calibri" w:hAnsi="Calibri"/>
-                <w:b w:val="0"/>
-                <w:sz w:val="18"/>
-              </w:rPr>
-              <w:t>Prints e indicadores anonimizados.</w:t>
-            </w:r>
-          </w:p>
-        </w:tc>
-      </w:tr>
-      <w:tr>
-        <w:tc>
-          <w:tcPr>
-            <w:tcW w:type="dxa" w:w="1440"/>
-            <w:vAlign w:val="center"/>
-            <w:tcBorders>
-              <w:top w:val="single" w:sz="8" w:space="0" w:color="D8DEE9"/>
-              <w:left w:val="single" w:sz="8" w:space="0" w:color="D8DEE9"/>
-              <w:bottom w:val="single" w:sz="8" w:space="0" w:color="D8DEE9"/>
-              <w:right w:val="single" w:sz="8" w:space="0" w:color="D8DEE9"/>
-            </w:tcBorders>
-          </w:tcPr>
-          <w:p>
-            <w:pPr>
-              <w:spacing w:after="0"/>
-            </w:pPr>
-            <w:r>
-              <w:rPr>
-                <w:rFonts w:ascii="Calibri" w:hAnsi="Calibri"/>
-                <w:b w:val="0"/>
-                <w:sz w:val="18"/>
-              </w:rPr>
-              <w:t>Expansao Itanhaem</w:t>
-            </w:r>
-          </w:p>
-        </w:tc>
-        <w:tc>
-          <w:tcPr>
-            <w:tcW w:type="dxa" w:w="1440"/>
-            <w:vAlign w:val="center"/>
-            <w:tcBorders>
-              <w:top w:val="single" w:sz="8" w:space="0" w:color="D8DEE9"/>
-              <w:left w:val="single" w:sz="8" w:space="0" w:color="D8DEE9"/>
-              <w:bottom w:val="single" w:sz="8" w:space="0" w:color="D8DEE9"/>
-              <w:right w:val="single" w:sz="8" w:space="0" w:color="D8DEE9"/>
-            </w:tcBorders>
-          </w:tcPr>
-          <w:p>
-            <w:pPr>
-              <w:spacing w:after="0"/>
-            </w:pPr>
-            <w:r>
-              <w:rPr>
-                <w:rFonts w:ascii="Calibri" w:hAnsi="Calibri"/>
-                <w:b w:val="0"/>
-                <w:sz w:val="18"/>
-              </w:rPr>
-              <w:t>Acao presencial</w:t>
-            </w:r>
-          </w:p>
-        </w:tc>
-        <w:tc>
-          <w:tcPr>
-            <w:tcW w:type="dxa" w:w="4320"/>
-            <w:vAlign w:val="center"/>
-            <w:tcBorders>
-              <w:top w:val="single" w:sz="8" w:space="0" w:color="D8DEE9"/>
-              <w:left w:val="single" w:sz="8" w:space="0" w:color="D8DEE9"/>
-              <w:bottom w:val="single" w:sz="8" w:space="0" w:color="D8DEE9"/>
-              <w:right w:val="single" w:sz="8" w:space="0" w:color="D8DEE9"/>
-            </w:tcBorders>
-          </w:tcPr>
-          <w:p>
-            <w:pPr>
-              <w:spacing w:after="0"/>
-            </w:pPr>
-            <w:r>
-              <w:rPr>
-                <w:rFonts w:ascii="Calibri" w:hAnsi="Calibri"/>
-                <w:b w:val="0"/>
-                <w:sz w:val="18"/>
-              </w:rPr>
-              <w:t>Inclusao de localidade, filtragem por local da acao e refinamento multiunidade.</w:t>
-            </w:r>
-          </w:p>
-        </w:tc>
-        <w:tc>
-          <w:tcPr>
-            <w:tcW w:type="dxa" w:w="1872"/>
-            <w:vAlign w:val="center"/>
-            <w:tcBorders>
-              <w:top w:val="single" w:sz="8" w:space="0" w:color="D8DEE9"/>
-              <w:left w:val="single" w:sz="8" w:space="0" w:color="D8DEE9"/>
-              <w:bottom w:val="single" w:sz="8" w:space="0" w:color="D8DEE9"/>
-              <w:right w:val="single" w:sz="8" w:space="0" w:color="D8DEE9"/>
-            </w:tcBorders>
-          </w:tcPr>
-          <w:p>
-            <w:pPr>
-              <w:spacing w:after="0"/>
-            </w:pPr>
-            <w:r>
-              <w:rPr>
-                <w:rFonts w:ascii="Calibri" w:hAnsi="Calibri"/>
-                <w:b w:val="0"/>
-                <w:sz w:val="18"/>
-              </w:rPr>
-              <w:t>Sistema operando com Santos e Itanhaem.</w:t>
-            </w:r>
-          </w:p>
-        </w:tc>
-      </w:tr>
-    </w:tbl>
     <w:p>
-      <w:pPr>
-        <w:pStyle w:val="Heading1"/>
-        <w:spacing w:before="240" w:after="100"/>
-      </w:pPr>
-      <w:r>
-        <w:rPr>
-          <w:rFonts w:ascii="Calibri" w:hAnsi="Calibri"/>
-          <w:b/>
-          <w:color w:val="292F63"/>
-          <w:sz w:val="32"/>
-        </w:rPr>
-        <w:t>Tecnologias Utilizadas</w:t>
-      </w:r>
-    </w:p>
-    <w:tbl>
-      <w:tblPr>
-        <w:tblW w:type="auto" w:w="0"/>
-        <w:jc w:val="center"/>
-        <w:tblLayout w:type="fixed"/>
-        <w:tblLook w:firstColumn="1" w:firstRow="1" w:lastColumn="0" w:lastRow="0" w:noHBand="0" w:noVBand="1" w:val="04A0"/>
-      </w:tblPr>
-      <w:tblGrid>
-        <w:gridCol w:w="3312"/>
-        <w:gridCol w:w="3312"/>
-        <w:gridCol w:w="3312"/>
-      </w:tblGrid>
-      <w:tr>
-        <w:tc>
-          <w:tcPr>
-            <w:tcW w:type="dxa" w:w="1512"/>
-            <w:vAlign w:val="center"/>
-            <w:shd w:fill="EAF1FF"/>
-            <w:tcBorders>
-              <w:top w:val="single" w:sz="8" w:space="0" w:color="D8DEE9"/>
-              <w:left w:val="single" w:sz="8" w:space="0" w:color="D8DEE9"/>
-              <w:bottom w:val="single" w:sz="8" w:space="0" w:color="D8DEE9"/>
-              <w:right w:val="single" w:sz="8" w:space="0" w:color="D8DEE9"/>
-            </w:tcBorders>
-          </w:tcPr>
-          <w:p>
-            <w:pPr>
-              <w:jc w:val="center"/>
-            </w:pPr>
-            <w:r>
-              <w:rPr>
-                <w:rFonts w:ascii="Calibri" w:hAnsi="Calibri"/>
-                <w:b/>
-                <w:color w:val="292F63"/>
-                <w:sz w:val="18"/>
-              </w:rPr>
-              <w:t>Camada</w:t>
-            </w:r>
-          </w:p>
-        </w:tc>
-        <w:tc>
-          <w:tcPr>
-            <w:tcW w:type="dxa" w:w="3168"/>
-            <w:vAlign w:val="center"/>
-            <w:shd w:fill="EAF1FF"/>
-            <w:tcBorders>
-              <w:top w:val="single" w:sz="8" w:space="0" w:color="D8DEE9"/>
-              <w:left w:val="single" w:sz="8" w:space="0" w:color="D8DEE9"/>
-              <w:bottom w:val="single" w:sz="8" w:space="0" w:color="D8DEE9"/>
-              <w:right w:val="single" w:sz="8" w:space="0" w:color="D8DEE9"/>
-            </w:tcBorders>
-          </w:tcPr>
-          <w:p>
-            <w:pPr>
-              <w:jc w:val="center"/>
-            </w:pPr>
-            <w:r>
-              <w:rPr>
-                <w:rFonts w:ascii="Calibri" w:hAnsi="Calibri"/>
-                <w:b/>
-                <w:color w:val="292F63"/>
-                <w:sz w:val="18"/>
-              </w:rPr>
-              <w:t>Tecnologias</w:t>
-            </w:r>
-          </w:p>
-        </w:tc>
-        <w:tc>
-          <w:tcPr>
-            <w:tcW w:type="dxa" w:w="4320"/>
-            <w:vAlign w:val="center"/>
-            <w:shd w:fill="EAF1FF"/>
-            <w:tcBorders>
-              <w:top w:val="single" w:sz="8" w:space="0" w:color="D8DEE9"/>
-              <w:left w:val="single" w:sz="8" w:space="0" w:color="D8DEE9"/>
-              <w:bottom w:val="single" w:sz="8" w:space="0" w:color="D8DEE9"/>
-              <w:right w:val="single" w:sz="8" w:space="0" w:color="D8DEE9"/>
-            </w:tcBorders>
-          </w:tcPr>
-          <w:p>
-            <w:pPr>
-              <w:jc w:val="center"/>
-            </w:pPr>
-            <w:r>
-              <w:rPr>
-                <w:rFonts w:ascii="Calibri" w:hAnsi="Calibri"/>
-                <w:b/>
-                <w:color w:val="292F63"/>
-                <w:sz w:val="18"/>
-              </w:rPr>
-              <w:t>Aplicacao no projeto</w:t>
-            </w:r>
-          </w:p>
-        </w:tc>
-      </w:tr>
-      <w:tr>
-        <w:tc>
-          <w:tcPr>
-            <w:tcW w:type="dxa" w:w="1512"/>
-            <w:vAlign w:val="center"/>
-            <w:tcBorders>
-              <w:top w:val="single" w:sz="8" w:space="0" w:color="D8DEE9"/>
-              <w:left w:val="single" w:sz="8" w:space="0" w:color="D8DEE9"/>
-              <w:bottom w:val="single" w:sz="8" w:space="0" w:color="D8DEE9"/>
-              <w:right w:val="single" w:sz="8" w:space="0" w:color="D8DEE9"/>
-            </w:tcBorders>
-          </w:tcPr>
-          <w:p>
-            <w:pPr>
-              <w:spacing w:after="0"/>
-            </w:pPr>
-            <w:r>
-              <w:rPr>
-                <w:rFonts w:ascii="Calibri" w:hAnsi="Calibri"/>
-                <w:b w:val="0"/>
-                <w:sz w:val="18"/>
-              </w:rPr>
-              <w:t>Frontend</w:t>
-            </w:r>
-          </w:p>
-        </w:tc>
-        <w:tc>
-          <w:tcPr>
-            <w:tcW w:type="dxa" w:w="3168"/>
-            <w:vAlign w:val="center"/>
-            <w:tcBorders>
-              <w:top w:val="single" w:sz="8" w:space="0" w:color="D8DEE9"/>
-              <w:left w:val="single" w:sz="8" w:space="0" w:color="D8DEE9"/>
-              <w:bottom w:val="single" w:sz="8" w:space="0" w:color="D8DEE9"/>
-              <w:right w:val="single" w:sz="8" w:space="0" w:color="D8DEE9"/>
-            </w:tcBorders>
-          </w:tcPr>
-          <w:p>
-            <w:pPr>
-              <w:spacing w:after="0"/>
-            </w:pPr>
-            <w:r>
-              <w:rPr>
-                <w:rFonts w:ascii="Calibri" w:hAnsi="Calibri"/>
-                <w:b w:val="0"/>
-                <w:sz w:val="18"/>
-              </w:rPr>
-              <w:t>React, Vite, Tailwind CSS, Lucide React</w:t>
-            </w:r>
-          </w:p>
-        </w:tc>
-        <w:tc>
-          <w:tcPr>
-            <w:tcW w:type="dxa" w:w="4320"/>
-            <w:vAlign w:val="center"/>
-            <w:tcBorders>
-              <w:top w:val="single" w:sz="8" w:space="0" w:color="D8DEE9"/>
-              <w:left w:val="single" w:sz="8" w:space="0" w:color="D8DEE9"/>
-              <w:bottom w:val="single" w:sz="8" w:space="0" w:color="D8DEE9"/>
-              <w:right w:val="single" w:sz="8" w:space="0" w:color="D8DEE9"/>
-            </w:tcBorders>
-          </w:tcPr>
-          <w:p>
-            <w:pPr>
-              <w:spacing w:after="0"/>
-            </w:pPr>
-            <w:r>
-              <w:rPr>
-                <w:rFonts w:ascii="Calibri" w:hAnsi="Calibri"/>
-                <w:b w:val="0"/>
-                <w:sz w:val="18"/>
-              </w:rPr>
-              <w:t>Interface responsiva para celular/notebook, componentes de formulario, fila, dashboards e navegacao.</w:t>
-            </w:r>
-          </w:p>
-        </w:tc>
-      </w:tr>
-      <w:tr>
-        <w:tc>
-          <w:tcPr>
-            <w:tcW w:type="dxa" w:w="1512"/>
-            <w:vAlign w:val="center"/>
-            <w:tcBorders>
-              <w:top w:val="single" w:sz="8" w:space="0" w:color="D8DEE9"/>
-              <w:left w:val="single" w:sz="8" w:space="0" w:color="D8DEE9"/>
-              <w:bottom w:val="single" w:sz="8" w:space="0" w:color="D8DEE9"/>
-              <w:right w:val="single" w:sz="8" w:space="0" w:color="D8DEE9"/>
-            </w:tcBorders>
-          </w:tcPr>
-          <w:p>
-            <w:pPr>
-              <w:spacing w:after="0"/>
-            </w:pPr>
-            <w:r>
-              <w:rPr>
-                <w:rFonts w:ascii="Calibri" w:hAnsi="Calibri"/>
-                <w:b w:val="0"/>
-                <w:sz w:val="18"/>
-              </w:rPr>
-              <w:t>Backend</w:t>
-            </w:r>
-          </w:p>
-        </w:tc>
-        <w:tc>
-          <w:tcPr>
-            <w:tcW w:type="dxa" w:w="3168"/>
-            <w:vAlign w:val="center"/>
-            <w:tcBorders>
-              <w:top w:val="single" w:sz="8" w:space="0" w:color="D8DEE9"/>
-              <w:left w:val="single" w:sz="8" w:space="0" w:color="D8DEE9"/>
-              <w:bottom w:val="single" w:sz="8" w:space="0" w:color="D8DEE9"/>
-              <w:right w:val="single" w:sz="8" w:space="0" w:color="D8DEE9"/>
-            </w:tcBorders>
-          </w:tcPr>
-          <w:p>
-            <w:pPr>
-              <w:spacing w:after="0"/>
-            </w:pPr>
-            <w:r>
-              <w:rPr>
-                <w:rFonts w:ascii="Calibri" w:hAnsi="Calibri"/>
-                <w:b w:val="0"/>
-                <w:sz w:val="18"/>
-              </w:rPr>
-              <w:t>Firebase Authentication, Cloud Firestore, Storage, Cloud Functions</w:t>
-            </w:r>
-          </w:p>
-        </w:tc>
-        <w:tc>
-          <w:tcPr>
-            <w:tcW w:type="dxa" w:w="4320"/>
-            <w:vAlign w:val="center"/>
-            <w:tcBorders>
-              <w:top w:val="single" w:sz="8" w:space="0" w:color="D8DEE9"/>
-              <w:left w:val="single" w:sz="8" w:space="0" w:color="D8DEE9"/>
-              <w:bottom w:val="single" w:sz="8" w:space="0" w:color="D8DEE9"/>
-              <w:right w:val="single" w:sz="8" w:space="0" w:color="D8DEE9"/>
-            </w:tcBorders>
-          </w:tcPr>
-          <w:p>
-            <w:pPr>
-              <w:spacing w:after="0"/>
-            </w:pPr>
-            <w:r>
-              <w:rPr>
-                <w:rFonts w:ascii="Calibri" w:hAnsi="Calibri"/>
-                <w:b w:val="0"/>
-                <w:sz w:val="18"/>
-              </w:rPr>
-              <w:t>Login, confirmacao de e-mail, banco em tempo real, fotos de perfil e rotinas administrativas.</w:t>
-            </w:r>
-          </w:p>
-        </w:tc>
-      </w:tr>
-      <w:tr>
-        <w:tc>
-          <w:tcPr>
-            <w:tcW w:type="dxa" w:w="1512"/>
-            <w:vAlign w:val="center"/>
-            <w:tcBorders>
-              <w:top w:val="single" w:sz="8" w:space="0" w:color="D8DEE9"/>
-              <w:left w:val="single" w:sz="8" w:space="0" w:color="D8DEE9"/>
-              <w:bottom w:val="single" w:sz="8" w:space="0" w:color="D8DEE9"/>
-              <w:right w:val="single" w:sz="8" w:space="0" w:color="D8DEE9"/>
-            </w:tcBorders>
-          </w:tcPr>
-          <w:p>
-            <w:pPr>
-              <w:spacing w:after="0"/>
-            </w:pPr>
-            <w:r>
-              <w:rPr>
-                <w:rFonts w:ascii="Calibri" w:hAnsi="Calibri"/>
-                <w:b w:val="0"/>
-                <w:sz w:val="18"/>
-              </w:rPr>
-              <w:t>Dados</w:t>
-            </w:r>
-          </w:p>
-        </w:tc>
-        <w:tc>
-          <w:tcPr>
-            <w:tcW w:type="dxa" w:w="3168"/>
-            <w:vAlign w:val="center"/>
-            <w:tcBorders>
-              <w:top w:val="single" w:sz="8" w:space="0" w:color="D8DEE9"/>
-              <w:left w:val="single" w:sz="8" w:space="0" w:color="D8DEE9"/>
-              <w:bottom w:val="single" w:sz="8" w:space="0" w:color="D8DEE9"/>
-              <w:right w:val="single" w:sz="8" w:space="0" w:color="D8DEE9"/>
-            </w:tcBorders>
-          </w:tcPr>
-          <w:p>
-            <w:pPr>
-              <w:spacing w:after="0"/>
-            </w:pPr>
-            <w:r>
-              <w:rPr>
-                <w:rFonts w:ascii="Calibri" w:hAnsi="Calibri"/>
-                <w:b w:val="0"/>
-                <w:sz w:val="18"/>
-              </w:rPr>
-              <w:t>Modelo por colecoes, campo localAcao, status e timestamps</w:t>
-            </w:r>
-          </w:p>
-        </w:tc>
-        <w:tc>
-          <w:tcPr>
-            <w:tcW w:type="dxa" w:w="4320"/>
-            <w:vAlign w:val="center"/>
-            <w:tcBorders>
-              <w:top w:val="single" w:sz="8" w:space="0" w:color="D8DEE9"/>
-              <w:left w:val="single" w:sz="8" w:space="0" w:color="D8DEE9"/>
-              <w:bottom w:val="single" w:sz="8" w:space="0" w:color="D8DEE9"/>
-              <w:right w:val="single" w:sz="8" w:space="0" w:color="D8DEE9"/>
-            </w:tcBorders>
-          </w:tcPr>
-          <w:p>
-            <w:pPr>
-              <w:spacing w:after="0"/>
-            </w:pPr>
-            <w:r>
-              <w:rPr>
-                <w:rFonts w:ascii="Calibri" w:hAnsi="Calibri"/>
-                <w:b w:val="0"/>
-                <w:sz w:val="18"/>
-              </w:rPr>
-              <w:t>Isolamento dos prontuarios e indicadores por local real do atendimento.</w:t>
-            </w:r>
-          </w:p>
-        </w:tc>
-      </w:tr>
-      <w:tr>
-        <w:tc>
-          <w:tcPr>
-            <w:tcW w:type="dxa" w:w="1512"/>
-            <w:vAlign w:val="center"/>
-            <w:tcBorders>
-              <w:top w:val="single" w:sz="8" w:space="0" w:color="D8DEE9"/>
-              <w:left w:val="single" w:sz="8" w:space="0" w:color="D8DEE9"/>
-              <w:bottom w:val="single" w:sz="8" w:space="0" w:color="D8DEE9"/>
-              <w:right w:val="single" w:sz="8" w:space="0" w:color="D8DEE9"/>
-            </w:tcBorders>
-          </w:tcPr>
-          <w:p>
-            <w:pPr>
-              <w:spacing w:after="0"/>
-            </w:pPr>
-            <w:r>
-              <w:rPr>
-                <w:rFonts w:ascii="Calibri" w:hAnsi="Calibri"/>
-                <w:b w:val="0"/>
-                <w:sz w:val="18"/>
-              </w:rPr>
-              <w:t>Exportacao</w:t>
-            </w:r>
-          </w:p>
-        </w:tc>
-        <w:tc>
-          <w:tcPr>
-            <w:tcW w:type="dxa" w:w="3168"/>
-            <w:vAlign w:val="center"/>
-            <w:tcBorders>
-              <w:top w:val="single" w:sz="8" w:space="0" w:color="D8DEE9"/>
-              <w:left w:val="single" w:sz="8" w:space="0" w:color="D8DEE9"/>
-              <w:bottom w:val="single" w:sz="8" w:space="0" w:color="D8DEE9"/>
-              <w:right w:val="single" w:sz="8" w:space="0" w:color="D8DEE9"/>
-            </w:tcBorders>
-          </w:tcPr>
-          <w:p>
-            <w:pPr>
-              <w:spacing w:after="0"/>
-            </w:pPr>
-            <w:r>
-              <w:rPr>
-                <w:rFonts w:ascii="Calibri" w:hAnsi="Calibri"/>
-                <w:b w:val="0"/>
-                <w:sz w:val="18"/>
-              </w:rPr>
-              <w:t>write-excel-file</w:t>
-            </w:r>
-          </w:p>
-        </w:tc>
-        <w:tc>
-          <w:tcPr>
-            <w:tcW w:type="dxa" w:w="4320"/>
-            <w:vAlign w:val="center"/>
-            <w:tcBorders>
-              <w:top w:val="single" w:sz="8" w:space="0" w:color="D8DEE9"/>
-              <w:left w:val="single" w:sz="8" w:space="0" w:color="D8DEE9"/>
-              <w:bottom w:val="single" w:sz="8" w:space="0" w:color="D8DEE9"/>
-              <w:right w:val="single" w:sz="8" w:space="0" w:color="D8DEE9"/>
-            </w:tcBorders>
-          </w:tcPr>
-          <w:p>
-            <w:pPr>
-              <w:spacing w:after="0"/>
-            </w:pPr>
-            <w:r>
-              <w:rPr>
-                <w:rFonts w:ascii="Calibri" w:hAnsi="Calibri"/>
-                <w:b w:val="0"/>
-                <w:sz w:val="18"/>
-              </w:rPr>
-              <w:t>Planilhas por data e geral, com abas por area e informacoes consolidadas.</w:t>
-            </w:r>
-          </w:p>
-        </w:tc>
-      </w:tr>
-      <w:tr>
-        <w:tc>
-          <w:tcPr>
-            <w:tcW w:type="dxa" w:w="1512"/>
-            <w:vAlign w:val="center"/>
-            <w:tcBorders>
-              <w:top w:val="single" w:sz="8" w:space="0" w:color="D8DEE9"/>
-              <w:left w:val="single" w:sz="8" w:space="0" w:color="D8DEE9"/>
-              <w:bottom w:val="single" w:sz="8" w:space="0" w:color="D8DEE9"/>
-              <w:right w:val="single" w:sz="8" w:space="0" w:color="D8DEE9"/>
-            </w:tcBorders>
-          </w:tcPr>
-          <w:p>
-            <w:pPr>
-              <w:spacing w:after="0"/>
-            </w:pPr>
-            <w:r>
-              <w:rPr>
-                <w:rFonts w:ascii="Calibri" w:hAnsi="Calibri"/>
-                <w:b w:val="0"/>
-                <w:sz w:val="18"/>
-              </w:rPr>
-              <w:t>Publicacao</w:t>
-            </w:r>
-          </w:p>
-        </w:tc>
-        <w:tc>
-          <w:tcPr>
-            <w:tcW w:type="dxa" w:w="3168"/>
-            <w:vAlign w:val="center"/>
-            <w:tcBorders>
-              <w:top w:val="single" w:sz="8" w:space="0" w:color="D8DEE9"/>
-              <w:left w:val="single" w:sz="8" w:space="0" w:color="D8DEE9"/>
-              <w:bottom w:val="single" w:sz="8" w:space="0" w:color="D8DEE9"/>
-              <w:right w:val="single" w:sz="8" w:space="0" w:color="D8DEE9"/>
-            </w:tcBorders>
-          </w:tcPr>
-          <w:p>
-            <w:pPr>
-              <w:spacing w:after="0"/>
-            </w:pPr>
-            <w:r>
-              <w:rPr>
-                <w:rFonts w:ascii="Calibri" w:hAnsi="Calibri"/>
-                <w:b w:val="0"/>
-                <w:sz w:val="18"/>
-              </w:rPr>
-              <w:t>GitHub, Vercel, Analytics, Speed Insights</w:t>
-            </w:r>
-          </w:p>
-        </w:tc>
-        <w:tc>
-          <w:tcPr>
-            <w:tcW w:type="dxa" w:w="4320"/>
-            <w:vAlign w:val="center"/>
-            <w:tcBorders>
-              <w:top w:val="single" w:sz="8" w:space="0" w:color="D8DEE9"/>
-              <w:left w:val="single" w:sz="8" w:space="0" w:color="D8DEE9"/>
-              <w:bottom w:val="single" w:sz="8" w:space="0" w:color="D8DEE9"/>
-              <w:right w:val="single" w:sz="8" w:space="0" w:color="D8DEE9"/>
-            </w:tcBorders>
-          </w:tcPr>
-          <w:p>
-            <w:pPr>
-              <w:spacing w:after="0"/>
-            </w:pPr>
-            <w:r>
-              <w:rPr>
-                <w:rFonts w:ascii="Calibri" w:hAnsi="Calibri"/>
-                <w:b w:val="0"/>
-                <w:sz w:val="18"/>
-              </w:rPr>
-              <w:t>Versionamento, deploy web e monitoramento de acesso/desempenho.</w:t>
-            </w:r>
-          </w:p>
-        </w:tc>
-      </w:tr>
-      <w:tr>
-        <w:tc>
-          <w:tcPr>
-            <w:tcW w:type="dxa" w:w="1512"/>
-            <w:vAlign w:val="center"/>
-            <w:tcBorders>
-              <w:top w:val="single" w:sz="8" w:space="0" w:color="D8DEE9"/>
-              <w:left w:val="single" w:sz="8" w:space="0" w:color="D8DEE9"/>
-              <w:bottom w:val="single" w:sz="8" w:space="0" w:color="D8DEE9"/>
-              <w:right w:val="single" w:sz="8" w:space="0" w:color="D8DEE9"/>
-            </w:tcBorders>
-          </w:tcPr>
-          <w:p>
-            <w:pPr>
-              <w:spacing w:after="0"/>
-            </w:pPr>
-            <w:r>
-              <w:rPr>
-                <w:rFonts w:ascii="Calibri" w:hAnsi="Calibri"/>
-                <w:b w:val="0"/>
-                <w:sz w:val="18"/>
-              </w:rPr>
-              <w:t>Qualidade</w:t>
-            </w:r>
-          </w:p>
-        </w:tc>
-        <w:tc>
-          <w:tcPr>
-            <w:tcW w:type="dxa" w:w="3168"/>
-            <w:vAlign w:val="center"/>
-            <w:tcBorders>
-              <w:top w:val="single" w:sz="8" w:space="0" w:color="D8DEE9"/>
-              <w:left w:val="single" w:sz="8" w:space="0" w:color="D8DEE9"/>
-              <w:bottom w:val="single" w:sz="8" w:space="0" w:color="D8DEE9"/>
-              <w:right w:val="single" w:sz="8" w:space="0" w:color="D8DEE9"/>
-            </w:tcBorders>
-          </w:tcPr>
-          <w:p>
-            <w:pPr>
-              <w:spacing w:after="0"/>
-            </w:pPr>
-            <w:r>
-              <w:rPr>
-                <w:rFonts w:ascii="Calibri" w:hAnsi="Calibri"/>
-                <w:b w:val="0"/>
-                <w:sz w:val="18"/>
-              </w:rPr>
-              <w:t>ESLint, build Vite, testes manuais orientados por checklist</w:t>
-            </w:r>
-          </w:p>
-        </w:tc>
-        <w:tc>
-          <w:tcPr>
-            <w:tcW w:type="dxa" w:w="4320"/>
-            <w:vAlign w:val="center"/>
-            <w:tcBorders>
-              <w:top w:val="single" w:sz="8" w:space="0" w:color="D8DEE9"/>
-              <w:left w:val="single" w:sz="8" w:space="0" w:color="D8DEE9"/>
-              <w:bottom w:val="single" w:sz="8" w:space="0" w:color="D8DEE9"/>
-              <w:right w:val="single" w:sz="8" w:space="0" w:color="D8DEE9"/>
-            </w:tcBorders>
-          </w:tcPr>
-          <w:p>
-            <w:pPr>
-              <w:spacing w:after="0"/>
-            </w:pPr>
-            <w:r>
-              <w:rPr>
-                <w:rFonts w:ascii="Calibri" w:hAnsi="Calibri"/>
-                <w:b w:val="0"/>
-                <w:sz w:val="18"/>
-              </w:rPr>
-              <w:t>Reducao de erros, validacao do app e verificacao de fluxos principais.</w:t>
-            </w:r>
-          </w:p>
-        </w:tc>
-      </w:tr>
-    </w:tbl>
-    <w:p>
-      <w:pPr>
-        <w:jc w:val="center"/>
-      </w:pPr>
       <w:r>
         <w:drawing>
           <wp:inline xmlns:a="http://schemas.openxmlformats.org/drawingml/2006/main" xmlns:pic="http://schemas.openxmlformats.org/drawingml/2006/picture">
-            <wp:extent cx="5669280" cy="3259836"/>
+            <wp:extent cx="5577840" cy="3346704"/>
             <wp:docPr id="2" name="Picture 2"/>
             <wp:cNvGraphicFramePr>
               <a:graphicFrameLocks noChangeAspect="1"/>
@@ -1946,7 +768,7 @@
               <a:graphicData uri="http://schemas.openxmlformats.org/drawingml/2006/picture">
                 <pic:pic>
                   <pic:nvPicPr>
-                    <pic:cNvPr id="0" name="diagrama-arquitetura.png"/>
+                    <pic:cNvPr id="0" name="fluxo-operacional.png"/>
                     <pic:cNvPicPr/>
                   </pic:nvPicPr>
                   <pic:blipFill>
@@ -1958,7 +780,7 @@
                   <pic:spPr>
                     <a:xfrm>
                       <a:off x="0" y="0"/>
-                      <a:ext cx="5669280" cy="3259836"/>
+                      <a:ext cx="5577840" cy="3346704"/>
                     </a:xfrm>
                     <a:prstGeom prst="rect"/>
                   </pic:spPr>
@@ -1971,125 +793,17 @@
     </w:p>
     <w:p>
       <w:pPr>
-        <w:spacing w:after="140"/>
-        <w:jc w:val="center"/>
+        <w:pStyle w:val="Heading2"/>
       </w:pPr>
       <w:r>
-        <w:rPr>
-          <w:rFonts w:ascii="Calibri" w:hAnsi="Calibri"/>
-          <w:b/>
-          <w:color w:val="596379"/>
-          <w:sz w:val="17"/>
-        </w:rPr>
-        <w:t>Figura 2 - Arquitetura tecnica da solucao publicada na Vercel com Firebase.</w:t>
+        <w:t>Arquitetura técnica e segurança: frontend, Firebase, regras e funcoes.</w:t>
       </w:r>
     </w:p>
     <w:p>
-      <w:pPr>
-        <w:pStyle w:val="Heading1"/>
-        <w:spacing w:before="240" w:after="100"/>
-      </w:pPr>
-      <w:r>
-        <w:rPr>
-          <w:rFonts w:ascii="Calibri" w:hAnsi="Calibri"/>
-          <w:b/>
-          <w:color w:val="292F63"/>
-          <w:sz w:val="32"/>
-        </w:rPr>
-        <w:t>Seguranca, LGPD e Controle de Acesso</w:t>
-      </w:r>
-    </w:p>
-    <w:p>
-      <w:pPr>
-        <w:spacing w:after="120" w:line="276" w:lineRule="auto"/>
-      </w:pPr>
-      <w:r>
-        <w:rPr>
-          <w:rFonts w:ascii="Calibri" w:hAnsi="Calibri"/>
-          <w:b w:val="0"/>
-          <w:sz w:val="21"/>
-        </w:rPr>
-        <w:t>Por se tratar de registros clinico-sociais, o projeto adotou principios de minimizacao, finalidade, controle de acesso e rastreabilidade. O sistema evita exposicao desnecessaria de dados sensiveis, exige autenticacao, usa confirmacao de e-mail e separa permissoes conforme perfil operacional.</w:t>
-      </w:r>
-    </w:p>
-    <w:p>
-      <w:pPr>
-        <w:pStyle w:val="ListBullet"/>
-        <w:spacing w:after="60" w:line="264" w:lineRule="auto"/>
-      </w:pPr>
-      <w:r>
-        <w:rPr>
-          <w:rFonts w:ascii="Calibri" w:hAnsi="Calibri"/>
-          <w:b w:val="0"/>
-          <w:sz w:val="20"/>
-        </w:rPr>
-        <w:t>Voluntarios podem visualizar e registrar observacoes uteis para o fluxo, sem necessidade de travar a acao.</w:t>
-      </w:r>
-    </w:p>
-    <w:p>
-      <w:pPr>
-        <w:pStyle w:val="ListBullet"/>
-        <w:spacing w:after="60" w:line="264" w:lineRule="auto"/>
-      </w:pPr>
-      <w:r>
-        <w:rPr>
-          <w:rFonts w:ascii="Calibri" w:hAnsi="Calibri"/>
-          <w:b w:val="0"/>
-          <w:sz w:val="20"/>
-        </w:rPr>
-        <w:t>Academicos podem preencher sua area e submeter para validacao, sem concluir conduta final.</w:t>
-      </w:r>
-    </w:p>
-    <w:p>
-      <w:pPr>
-        <w:pStyle w:val="ListBullet"/>
-        <w:spacing w:after="60" w:line="264" w:lineRule="auto"/>
-      </w:pPr>
-      <w:r>
-        <w:rPr>
-          <w:rFonts w:ascii="Calibri" w:hAnsi="Calibri"/>
-          <w:b w:val="0"/>
-          <w:sz w:val="20"/>
-        </w:rPr>
-        <w:t>Profissionais formados podem definir conduta e assinar a conclusao do atendimento.</w:t>
-      </w:r>
-    </w:p>
-    <w:p>
-      <w:pPr>
-        <w:pStyle w:val="ListBullet"/>
-        <w:spacing w:after="60" w:line="264" w:lineRule="auto"/>
-      </w:pPr>
-      <w:r>
-        <w:rPr>
-          <w:rFonts w:ascii="Calibri" w:hAnsi="Calibri"/>
-          <w:b w:val="0"/>
-          <w:sz w:val="20"/>
-        </w:rPr>
-        <w:t>Coordenacao e administracao podem visualizar dashboards e exportar dados; a administracao possui permissoes ampliadas de gestao.</w:t>
-      </w:r>
-    </w:p>
-    <w:p>
-      <w:pPr>
-        <w:pStyle w:val="ListBullet"/>
-        <w:spacing w:after="60" w:line="264" w:lineRule="auto"/>
-      </w:pPr>
-      <w:r>
-        <w:rPr>
-          <w:rFonts w:ascii="Calibri" w:hAnsi="Calibri"/>
-          <w:b w:val="0"/>
-          <w:sz w:val="20"/>
-        </w:rPr>
-        <w:t>As evidencias publicadas no GitHub foram anonimizadas, sem CPF, RG, dados clinicos identificaveis ou credenciais.</w:t>
-      </w:r>
-    </w:p>
-    <w:p>
-      <w:pPr>
-        <w:jc w:val="center"/>
-      </w:pPr>
       <w:r>
         <w:drawing>
           <wp:inline xmlns:a="http://schemas.openxmlformats.org/drawingml/2006/main" xmlns:pic="http://schemas.openxmlformats.org/drawingml/2006/picture">
-            <wp:extent cx="5669280" cy="3259836"/>
+            <wp:extent cx="5577840" cy="3197962"/>
             <wp:docPr id="3" name="Picture 3"/>
             <wp:cNvGraphicFramePr>
               <a:graphicFrameLocks noChangeAspect="1"/>
@@ -2098,7 +812,7 @@
               <a:graphicData uri="http://schemas.openxmlformats.org/drawingml/2006/picture">
                 <pic:pic>
                   <pic:nvPicPr>
-                    <pic:cNvPr id="0" name="diagrama-dados.png"/>
+                    <pic:cNvPr id="0" name="arquitetura-seguranca.png"/>
                     <pic:cNvPicPr/>
                   </pic:nvPicPr>
                   <pic:blipFill>
@@ -2110,7 +824,69 @@
                   <pic:spPr>
                     <a:xfrm>
                       <a:off x="0" y="0"/>
-                      <a:ext cx="5669280" cy="3259836"/>
+                      <a:ext cx="5577840" cy="3197962"/>
+                    </a:xfrm>
+                    <a:prstGeom prst="rect"/>
+                  </pic:spPr>
+                </pic:pic>
+              </a:graphicData>
+            </a:graphic>
+          </wp:inline>
+        </w:drawing>
+      </w:r>
+    </w:p>
+    <w:p>
+      <w:r>
+        <w:br w:type="page"/>
+      </w:r>
+    </w:p>
+    <w:p>
+      <w:pPr>
+        <w:pStyle w:val="Heading1"/>
+      </w:pPr>
+      <w:r>
+        <w:t>Evidências de desenvolvimento e aplicação</w:t>
+      </w:r>
+    </w:p>
+    <w:p>
+      <w:r>
+        <w:t>As evidências abaixo foram sanitizadas para evitar exposicao de dados pessoais, documentos e informações clínicas identificaveis.</w:t>
+      </w:r>
+    </w:p>
+    <w:p>
+      <w:pPr>
+        <w:pStyle w:val="Heading2"/>
+      </w:pPr>
+      <w:r>
+        <w:t>Dashboard operacional</w:t>
+      </w:r>
+    </w:p>
+    <w:p>
+      <w:r>
+        <w:drawing>
+          <wp:inline xmlns:a="http://schemas.openxmlformats.org/drawingml/2006/main" xmlns:pic="http://schemas.openxmlformats.org/drawingml/2006/picture">
+            <wp:extent cx="4297680" cy="5000806"/>
+            <wp:docPr id="4" name="Picture 4"/>
+            <wp:cNvGraphicFramePr>
+              <a:graphicFrameLocks noChangeAspect="1"/>
+            </wp:cNvGraphicFramePr>
+            <a:graphic>
+              <a:graphicData uri="http://schemas.openxmlformats.org/drawingml/2006/picture">
+                <pic:pic>
+                  <pic:nvPicPr>
+                    <pic:cNvPr id="0" name="dashboard-operacional-sanitizado.png"/>
+                    <pic:cNvPicPr/>
+                  </pic:nvPicPr>
+                  <pic:blipFill>
+                    <a:blip r:embed="rId12"/>
+                    <a:stretch>
+                      <a:fillRect/>
+                    </a:stretch>
+                  </pic:blipFill>
+                  <pic:spPr>
+                    <a:xfrm>
+                      <a:off x="0" y="0"/>
+                      <a:ext cx="4297680" cy="5000806"/>
                     </a:xfrm>
                     <a:prstGeom prst="rect"/>
                   </pic:spPr>
@@ -2123,179 +899,17 @@
     </w:p>
     <w:p>
       <w:pPr>
-        <w:spacing w:after="140"/>
-        <w:jc w:val="center"/>
+        <w:pStyle w:val="Heading2"/>
       </w:pPr>
       <w:r>
-        <w:rPr>
-          <w:rFonts w:ascii="Calibri" w:hAnsi="Calibri"/>
-          <w:b/>
-          <w:color w:val="596379"/>
-          <w:sz w:val="17"/>
-        </w:rPr>
-        <w:t>Figura 3 - Modelo logico simplificado das colecoes e relacoes do sistema.</w:t>
+        <w:t>Indicadores operacionais</w:t>
       </w:r>
     </w:p>
     <w:p>
-      <w:pPr>
-        <w:pStyle w:val="Heading1"/>
-        <w:spacing w:before="240" w:after="100"/>
-      </w:pPr>
-      <w:r>
-        <w:rPr>
-          <w:rFonts w:ascii="Calibri" w:hAnsi="Calibri"/>
-          <w:b/>
-          <w:color w:val="292F63"/>
-          <w:sz w:val="32"/>
-        </w:rPr>
-        <w:t>Resultados Esperados e Obtidos</w:t>
-      </w:r>
-    </w:p>
-    <w:p>
-      <w:pPr>
-        <w:spacing w:after="120" w:line="276" w:lineRule="auto"/>
-      </w:pPr>
-      <w:r>
-        <w:rPr>
-          <w:rFonts w:ascii="Calibri" w:hAnsi="Calibri"/>
-          <w:b w:val="0"/>
-          <w:sz w:val="21"/>
-        </w:rPr>
-        <w:t>Os resultados esperados eram organizar o fluxo de acolhimento e reduzir a perda de informacoes durante as acoes presenciais. Esses resultados foram atingidos por meio de um prototipo funcional aplicado em campo, com registros de assistidos, triagens, censos sociais, atendimentos por area, fila de espera e dashboards por local da acao.</w:t>
-      </w:r>
-    </w:p>
-    <w:p>
-      <w:pPr>
-        <w:spacing w:after="120" w:line="276" w:lineRule="auto"/>
-      </w:pPr>
-      <w:r>
-        <w:rPr>
-          <w:rFonts w:ascii="Calibri" w:hAnsi="Calibri"/>
-          <w:b w:val="0"/>
-          <w:sz w:val="21"/>
-        </w:rPr>
-        <w:t>Em Santos-SP, o sistema apoiou a operacao na regiao do Paqueta/Centro POP, permitindo visualizar assistidos recentes, identificar atendimentos aguardando acao, registrar informacoes clinico-sociais e consolidar indicadores. Com a aceitacao dos voluntarios, a solucao foi adaptada para Itanhaem-SP, contemplando a regiao de Belas Artes e preparando a base para futuras cidades.</w:t>
-      </w:r>
-    </w:p>
-    <w:tbl>
-      <w:tblPr>
-        <w:tblW w:type="auto" w:w="0"/>
-        <w:jc w:val="center"/>
-        <w:tblLook w:firstColumn="1" w:firstRow="1" w:lastColumn="0" w:lastRow="0" w:noHBand="0" w:noVBand="1" w:val="04A0"/>
-      </w:tblPr>
-      <w:tblGrid>
-        <w:gridCol w:w="9936"/>
-      </w:tblGrid>
-      <w:tr>
-        <w:tc>
-          <w:tcPr>
-            <w:tcW w:type="dxa" w:w="9936"/>
-            <w:shd w:fill="EAFBF2"/>
-            <w:tcBorders>
-              <w:top w:val="single" w:sz="10" w:space="0" w:color="B8C7E6"/>
-              <w:left w:val="single" w:sz="10" w:space="0" w:color="B8C7E6"/>
-              <w:bottom w:val="single" w:sz="10" w:space="0" w:color="B8C7E6"/>
-              <w:right w:val="single" w:sz="10" w:space="0" w:color="B8C7E6"/>
-            </w:tcBorders>
-          </w:tcPr>
-          <w:p>
-            <w:pPr>
-              <w:spacing w:after="60"/>
-            </w:pPr>
-            <w:r>
-              <w:rPr>
-                <w:rFonts w:ascii="Calibri" w:hAnsi="Calibri"/>
-                <w:b/>
-                <w:color w:val="292F63"/>
-                <w:sz w:val="21"/>
-              </w:rPr>
-              <w:t>Resultado central</w:t>
-            </w:r>
-          </w:p>
-          <w:p>
-            <w:pPr>
-              <w:spacing w:after="0"/>
-            </w:pPr>
-            <w:r>
-              <w:rPr>
-                <w:rFonts w:ascii="Calibri" w:hAnsi="Calibri"/>
-                <w:b w:val="0"/>
-                <w:color w:val="596379"/>
-                <w:sz w:val="19"/>
-              </w:rPr>
-              <w:t>O projeto deixou de ser apenas um planejamento e passou a ser uma ferramenta aplicada, com evidencias reais de desenvolvimento, uso, indicadores e expansao territorial.</w:t>
-            </w:r>
-          </w:p>
-        </w:tc>
-      </w:tr>
-    </w:tbl>
-    <w:p>
-      <w:pPr>
-        <w:spacing w:after="40"/>
-      </w:pPr>
-    </w:p>
-    <w:p>
-      <w:pPr>
-        <w:jc w:val="center"/>
-      </w:pPr>
       <w:r>
         <w:drawing>
           <wp:inline xmlns:a="http://schemas.openxmlformats.org/drawingml/2006/main" xmlns:pic="http://schemas.openxmlformats.org/drawingml/2006/picture">
-            <wp:extent cx="5669280" cy="4181094"/>
-            <wp:docPr id="4" name="Picture 4"/>
-            <wp:cNvGraphicFramePr>
-              <a:graphicFrameLocks noChangeAspect="1"/>
-            </wp:cNvGraphicFramePr>
-            <a:graphic>
-              <a:graphicData uri="http://schemas.openxmlformats.org/drawingml/2006/picture">
-                <pic:pic>
-                  <pic:nvPicPr>
-                    <pic:cNvPr id="0" name="evidencias-montagem.png"/>
-                    <pic:cNvPicPr/>
-                  </pic:nvPicPr>
-                  <pic:blipFill>
-                    <a:blip r:embed="rId12"/>
-                    <a:stretch>
-                      <a:fillRect/>
-                    </a:stretch>
-                  </pic:blipFill>
-                  <pic:spPr>
-                    <a:xfrm>
-                      <a:off x="0" y="0"/>
-                      <a:ext cx="5669280" cy="4181094"/>
-                    </a:xfrm>
-                    <a:prstGeom prst="rect"/>
-                  </pic:spPr>
-                </pic:pic>
-              </a:graphicData>
-            </a:graphic>
-          </wp:inline>
-        </w:drawing>
-      </w:r>
-    </w:p>
-    <w:p>
-      <w:pPr>
-        <w:spacing w:after="140"/>
-        <w:jc w:val="center"/>
-      </w:pPr>
-      <w:r>
-        <w:rPr>
-          <w:rFonts w:ascii="Calibri" w:hAnsi="Calibri"/>
-          <w:b/>
-          <w:color w:val="596379"/>
-          <w:sz w:val="17"/>
-        </w:rPr>
-        <w:t>Figura 4 - Evidencias anonimizadas: dashboard, fluxo de assistidos, triagem e censo social.</w:t>
-      </w:r>
-    </w:p>
-    <w:p>
-      <w:pPr>
-        <w:jc w:val="center"/>
-      </w:pPr>
-      <w:r>
-        <w:drawing>
-          <wp:inline xmlns:a="http://schemas.openxmlformats.org/drawingml/2006/main" xmlns:pic="http://schemas.openxmlformats.org/drawingml/2006/picture">
-            <wp:extent cx="4937760" cy="5745607"/>
+            <wp:extent cx="4297680" cy="5000806"/>
             <wp:docPr id="5" name="Picture 5"/>
             <wp:cNvGraphicFramePr>
               <a:graphicFrameLocks noChangeAspect="1"/>
@@ -2316,7 +930,7 @@
                   <pic:spPr>
                     <a:xfrm>
                       <a:off x="0" y="0"/>
-                      <a:ext cx="4937760" cy="5745607"/>
+                      <a:ext cx="4297680" cy="5000806"/>
                     </a:xfrm>
                     <a:prstGeom prst="rect"/>
                   </pic:spPr>
@@ -2329,187 +943,276 @@
     </w:p>
     <w:p>
       <w:pPr>
-        <w:spacing w:after="140"/>
-        <w:jc w:val="center"/>
+        <w:pStyle w:val="Heading2"/>
       </w:pPr>
       <w:r>
-        <w:rPr>
-          <w:rFonts w:ascii="Calibri" w:hAnsi="Calibri"/>
-          <w:b/>
-          <w:color w:val="596379"/>
-          <w:sz w:val="17"/>
-        </w:rPr>
-        <w:t>Figura 5 - Indicadores operacionais anonimizados para acompanhamento da coordenacao.</w:t>
+        <w:t>Fluxo de assistidos</w:t>
+      </w:r>
+    </w:p>
+    <w:p>
+      <w:r>
+        <w:drawing>
+          <wp:inline xmlns:a="http://schemas.openxmlformats.org/drawingml/2006/main" xmlns:pic="http://schemas.openxmlformats.org/drawingml/2006/picture">
+            <wp:extent cx="4297680" cy="5000806"/>
+            <wp:docPr id="6" name="Picture 6"/>
+            <wp:cNvGraphicFramePr>
+              <a:graphicFrameLocks noChangeAspect="1"/>
+            </wp:cNvGraphicFramePr>
+            <a:graphic>
+              <a:graphicData uri="http://schemas.openxmlformats.org/drawingml/2006/picture">
+                <pic:pic>
+                  <pic:nvPicPr>
+                    <pic:cNvPr id="0" name="fluxo-assistidos-sanitizado.png"/>
+                    <pic:cNvPicPr/>
+                  </pic:nvPicPr>
+                  <pic:blipFill>
+                    <a:blip r:embed="rId14"/>
+                    <a:stretch>
+                      <a:fillRect/>
+                    </a:stretch>
+                  </pic:blipFill>
+                  <pic:spPr>
+                    <a:xfrm>
+                      <a:off x="0" y="0"/>
+                      <a:ext cx="4297680" cy="5000806"/>
+                    </a:xfrm>
+                    <a:prstGeom prst="rect"/>
+                  </pic:spPr>
+                </pic:pic>
+              </a:graphicData>
+            </a:graphic>
+          </wp:inline>
+        </w:drawing>
       </w:r>
     </w:p>
     <w:p>
       <w:pPr>
-        <w:pStyle w:val="Heading1"/>
-        <w:spacing w:before="240" w:after="100"/>
+        <w:pStyle w:val="Heading2"/>
       </w:pPr>
       <w:r>
-        <w:rPr>
-          <w:rFonts w:ascii="Calibri" w:hAnsi="Calibri"/>
-          <w:b/>
-          <w:color w:val="292F63"/>
-          <w:sz w:val="32"/>
-        </w:rPr>
-        <w:t>Consideracoes Finais</w:t>
+        <w:t>Ficha do assistido</w:t>
+      </w:r>
+    </w:p>
+    <w:p>
+      <w:r>
+        <w:drawing>
+          <wp:inline xmlns:a="http://schemas.openxmlformats.org/drawingml/2006/main" xmlns:pic="http://schemas.openxmlformats.org/drawingml/2006/picture">
+            <wp:extent cx="4297680" cy="5000806"/>
+            <wp:docPr id="7" name="Picture 7"/>
+            <wp:cNvGraphicFramePr>
+              <a:graphicFrameLocks noChangeAspect="1"/>
+            </wp:cNvGraphicFramePr>
+            <a:graphic>
+              <a:graphicData uri="http://schemas.openxmlformats.org/drawingml/2006/picture">
+                <pic:pic>
+                  <pic:nvPicPr>
+                    <pic:cNvPr id="0" name="ficha-assistido-sanitizado.png"/>
+                    <pic:cNvPicPr/>
+                  </pic:nvPicPr>
+                  <pic:blipFill>
+                    <a:blip r:embed="rId15"/>
+                    <a:stretch>
+                      <a:fillRect/>
+                    </a:stretch>
+                  </pic:blipFill>
+                  <pic:spPr>
+                    <a:xfrm>
+                      <a:off x="0" y="0"/>
+                      <a:ext cx="4297680" cy="5000806"/>
+                    </a:xfrm>
+                    <a:prstGeom prst="rect"/>
+                  </pic:spPr>
+                </pic:pic>
+              </a:graphicData>
+            </a:graphic>
+          </wp:inline>
+        </w:drawing>
       </w:r>
     </w:p>
     <w:p>
       <w:pPr>
-        <w:spacing w:after="120" w:line="276" w:lineRule="auto"/>
+        <w:pStyle w:val="Heading2"/>
       </w:pPr>
       <w:r>
-        <w:rPr>
-          <w:rFonts w:ascii="Calibri" w:hAnsi="Calibri"/>
-          <w:b w:val="0"/>
-          <w:sz w:val="21"/>
-        </w:rPr>
-        <w:t>A Atividade Extensionista II permitiu transformar uma necessidade concreta da comunidade em uma solucao tecnologica aplicada. O principal aprendizado foi que sistemas de saude em campo precisam ser simples, rapidos, inclusivos e seguros ao mesmo tempo. A solucao nao pode interromper a acao, mas deve orientar o voluntario para registrar o maximo de informacoes relevantes.</w:t>
+        <w:t>Triagem</w:t>
+      </w:r>
+    </w:p>
+    <w:p>
+      <w:r>
+        <w:drawing>
+          <wp:inline xmlns:a="http://schemas.openxmlformats.org/drawingml/2006/main" xmlns:pic="http://schemas.openxmlformats.org/drawingml/2006/picture">
+            <wp:extent cx="4297680" cy="5000806"/>
+            <wp:docPr id="8" name="Picture 8"/>
+            <wp:cNvGraphicFramePr>
+              <a:graphicFrameLocks noChangeAspect="1"/>
+            </wp:cNvGraphicFramePr>
+            <a:graphic>
+              <a:graphicData uri="http://schemas.openxmlformats.org/drawingml/2006/picture">
+                <pic:pic>
+                  <pic:nvPicPr>
+                    <pic:cNvPr id="0" name="triagem-sanitizada.png"/>
+                    <pic:cNvPicPr/>
+                  </pic:nvPicPr>
+                  <pic:blipFill>
+                    <a:blip r:embed="rId16"/>
+                    <a:stretch>
+                      <a:fillRect/>
+                    </a:stretch>
+                  </pic:blipFill>
+                  <pic:spPr>
+                    <a:xfrm>
+                      <a:off x="0" y="0"/>
+                      <a:ext cx="4297680" cy="5000806"/>
+                    </a:xfrm>
+                    <a:prstGeom prst="rect"/>
+                  </pic:spPr>
+                </pic:pic>
+              </a:graphicData>
+            </a:graphic>
+          </wp:inline>
+        </w:drawing>
       </w:r>
     </w:p>
     <w:p>
       <w:pPr>
-        <w:spacing w:after="120" w:line="276" w:lineRule="auto"/>
+        <w:pStyle w:val="Heading2"/>
       </w:pPr>
       <w:r>
-        <w:rPr>
-          <w:rFonts w:ascii="Calibri" w:hAnsi="Calibri"/>
-          <w:b w:val="0"/>
-          <w:sz w:val="21"/>
-        </w:rPr>
-        <w:t>As maiores dificuldades envolveram equilibrar usabilidade em celular, quantidade de campos clinico-sociais, seguranca de acesso, LGPD e necessidade de exportacao compreensivel para coordenacao. O processo iterativo foi essencial, pois os comentarios recebidos durante o uso geraram melhorias diretas nos formularios, nos alertas, na fila de espera, nos dashboards e na separacao por local de acao.</w:t>
+        <w:t>Priorização e atenção inclusiva</w:t>
+      </w:r>
+    </w:p>
+    <w:p>
+      <w:r>
+        <w:drawing>
+          <wp:inline xmlns:a="http://schemas.openxmlformats.org/drawingml/2006/main" xmlns:pic="http://schemas.openxmlformats.org/drawingml/2006/picture">
+            <wp:extent cx="4297680" cy="5000806"/>
+            <wp:docPr id="9" name="Picture 9"/>
+            <wp:cNvGraphicFramePr>
+              <a:graphicFrameLocks noChangeAspect="1"/>
+            </wp:cNvGraphicFramePr>
+            <a:graphic>
+              <a:graphicData uri="http://schemas.openxmlformats.org/drawingml/2006/picture">
+                <pic:pic>
+                  <pic:nvPicPr>
+                    <pic:cNvPr id="0" name="triagem-prioridade-sanitizada.png"/>
+                    <pic:cNvPicPr/>
+                  </pic:nvPicPr>
+                  <pic:blipFill>
+                    <a:blip r:embed="rId17"/>
+                    <a:stretch>
+                      <a:fillRect/>
+                    </a:stretch>
+                  </pic:blipFill>
+                  <pic:spPr>
+                    <a:xfrm>
+                      <a:off x="0" y="0"/>
+                      <a:ext cx="4297680" cy="5000806"/>
+                    </a:xfrm>
+                    <a:prstGeom prst="rect"/>
+                  </pic:spPr>
+                </pic:pic>
+              </a:graphicData>
+            </a:graphic>
+          </wp:inline>
+        </w:drawing>
       </w:r>
     </w:p>
     <w:p>
       <w:pPr>
-        <w:spacing w:after="120" w:line="276" w:lineRule="auto"/>
+        <w:pStyle w:val="Heading2"/>
       </w:pPr>
       <w:r>
-        <w:rPr>
-          <w:rFonts w:ascii="Calibri" w:hAnsi="Calibri"/>
-          <w:b w:val="0"/>
-          <w:sz w:val="21"/>
-        </w:rPr>
-        <w:t>Como melhorias futuras, recomenda-se evoluir o modo offline/PWA, aprimorar relatorios comparativos entre cidades, ampliar integracoes com servicos parceiros e criar rotinas automatizadas de backup e auditoria. O projeto, entretanto, ja cumpre a proposta da disciplina: comprova desenvolvimento, aplicacao real na comunidade, uso de tecnologia para inclusao digital e impacto pratico no trabalho da organizacao parceira.</w:t>
+        <w:t>Censo social</w:t>
+      </w:r>
+    </w:p>
+    <w:p>
+      <w:r>
+        <w:drawing>
+          <wp:inline xmlns:a="http://schemas.openxmlformats.org/drawingml/2006/main" xmlns:pic="http://schemas.openxmlformats.org/drawingml/2006/picture">
+            <wp:extent cx="4297680" cy="5000806"/>
+            <wp:docPr id="10" name="Picture 10"/>
+            <wp:cNvGraphicFramePr>
+              <a:graphicFrameLocks noChangeAspect="1"/>
+            </wp:cNvGraphicFramePr>
+            <a:graphic>
+              <a:graphicData uri="http://schemas.openxmlformats.org/drawingml/2006/picture">
+                <pic:pic>
+                  <pic:nvPicPr>
+                    <pic:cNvPr id="0" name="censo-social-sanitizado.png"/>
+                    <pic:cNvPicPr/>
+                  </pic:nvPicPr>
+                  <pic:blipFill>
+                    <a:blip r:embed="rId18"/>
+                    <a:stretch>
+                      <a:fillRect/>
+                    </a:stretch>
+                  </pic:blipFill>
+                  <pic:spPr>
+                    <a:xfrm>
+                      <a:off x="0" y="0"/>
+                      <a:ext cx="4297680" cy="5000806"/>
+                    </a:xfrm>
+                    <a:prstGeom prst="rect"/>
+                  </pic:spPr>
+                </pic:pic>
+              </a:graphicData>
+            </a:graphic>
+          </wp:inline>
+        </w:drawing>
       </w:r>
     </w:p>
     <w:p>
       <w:pPr>
-        <w:pStyle w:val="Heading1"/>
-        <w:spacing w:before="240" w:after="100"/>
+        <w:pStyle w:val="Heading2"/>
       </w:pPr>
       <w:r>
-        <w:rPr>
-          <w:rFonts w:ascii="Calibri" w:hAnsi="Calibri"/>
-          <w:b/>
-          <w:color w:val="292F63"/>
-          <w:sz w:val="32"/>
-        </w:rPr>
-        <w:t>Referencias</w:t>
+        <w:t>Uso de substancias no censo</w:t>
       </w:r>
     </w:p>
     <w:p>
-      <w:pPr>
-        <w:pStyle w:val="ListBullet"/>
-        <w:spacing w:after="60" w:line="264" w:lineRule="auto"/>
-      </w:pPr>
       <w:r>
-        <w:rPr>
-          <w:rFonts w:ascii="Calibri" w:hAnsi="Calibri"/>
-          <w:b w:val="0"/>
-          <w:sz w:val="20"/>
-        </w:rPr>
-        <w:t>Centro Universitario Internacional UNINTER. Manual das Atividades Extensionistas: Tecnologia Aplicada a Inclusao Digital.</w:t>
-      </w:r>
-    </w:p>
-    <w:p>
-      <w:pPr>
-        <w:pStyle w:val="ListBullet"/>
-        <w:spacing w:after="60" w:line="264" w:lineRule="auto"/>
-      </w:pPr>
-      <w:r>
-        <w:rPr>
-          <w:rFonts w:ascii="Calibri" w:hAnsi="Calibri"/>
-          <w:b w:val="0"/>
-          <w:sz w:val="20"/>
-        </w:rPr>
-        <w:t>Centro Universitario Internacional UNINTER. Manual - Atividade Extensionista II: Tecnologia Aplicada a Inclusao Digital - Projeto.</w:t>
-      </w:r>
-    </w:p>
-    <w:p>
-      <w:pPr>
-        <w:pStyle w:val="ListBullet"/>
-        <w:spacing w:after="60" w:line="264" w:lineRule="auto"/>
-      </w:pPr>
-      <w:r>
-        <w:rPr>
-          <w:rFonts w:ascii="Calibri" w:hAnsi="Calibri"/>
-          <w:b w:val="0"/>
-          <w:sz w:val="20"/>
-        </w:rPr>
-        <w:t>Lei Geral de Protecao de Dados Pessoais - Lei n. 13.709/2018.</w:t>
-      </w:r>
-    </w:p>
-    <w:p>
-      <w:pPr>
-        <w:pStyle w:val="ListBullet"/>
-        <w:spacing w:after="60" w:line="264" w:lineRule="auto"/>
-      </w:pPr>
-      <w:r>
-        <w:rPr>
-          <w:rFonts w:ascii="Calibri" w:hAnsi="Calibri"/>
-          <w:b w:val="0"/>
-          <w:sz w:val="20"/>
-        </w:rPr>
-        <w:t>Organizacao das Nacoes Unidas. Objetivos de Desenvolvimento Sustentavel.</w:t>
-      </w:r>
-    </w:p>
-    <w:p>
-      <w:pPr>
-        <w:pStyle w:val="ListBullet"/>
-        <w:spacing w:after="60" w:line="264" w:lineRule="auto"/>
-      </w:pPr>
-      <w:r>
-        <w:rPr>
-          <w:rFonts w:ascii="Calibri" w:hAnsi="Calibri"/>
-          <w:b w:val="0"/>
-          <w:sz w:val="20"/>
-        </w:rPr>
-        <w:t>Documentacao tecnica utilizada no desenvolvimento: React, Vite, Firebase, Vercel e write-excel-file.</w:t>
+        <w:drawing>
+          <wp:inline xmlns:a="http://schemas.openxmlformats.org/drawingml/2006/main" xmlns:pic="http://schemas.openxmlformats.org/drawingml/2006/picture">
+            <wp:extent cx="4297680" cy="5000806"/>
+            <wp:docPr id="11" name="Picture 11"/>
+            <wp:cNvGraphicFramePr>
+              <a:graphicFrameLocks noChangeAspect="1"/>
+            </wp:cNvGraphicFramePr>
+            <a:graphic>
+              <a:graphicData uri="http://schemas.openxmlformats.org/drawingml/2006/picture">
+                <pic:pic>
+                  <pic:nvPicPr>
+                    <pic:cNvPr id="0" name="censo-substancias-sanitizado.png"/>
+                    <pic:cNvPicPr/>
+                  </pic:nvPicPr>
+                  <pic:blipFill>
+                    <a:blip r:embed="rId19"/>
+                    <a:stretch>
+                      <a:fillRect/>
+                    </a:stretch>
+                  </pic:blipFill>
+                  <pic:spPr>
+                    <a:xfrm>
+                      <a:off x="0" y="0"/>
+                      <a:ext cx="4297680" cy="5000806"/>
+                    </a:xfrm>
+                    <a:prstGeom prst="rect"/>
+                  </pic:spPr>
+                </pic:pic>
+              </a:graphicData>
+            </a:graphic>
+          </wp:inline>
+        </w:drawing>
       </w:r>
     </w:p>
     <w:sectPr>
-      <w:footerReference w:type="default" r:id="rId14"/>
-      <w:pgSz w:w="12240" w:h="15840"/>
-      <w:pgMar w:top="1080" w:right="1152" w:bottom="1080" w:left="1152" w:header="720" w:footer="720" w:gutter="0"/>
+      <w:pgSz w:w="11909" w:h="16834"/>
+      <w:pgMar w:top="1152" w:right="1224" w:bottom="1080" w:left="1224" w:header="720" w:footer="720" w:gutter="0"/>
       <w:cols w:space="720"/>
       <w:docGrid w:linePitch="360"/>
     </w:sectPr>
   </w:body>
 </w:document>
-</file>
-
-<file path=word/footer1.xml><?xml version="1.0" encoding="utf-8"?>
-<w:ftr xmlns:m="http://schemas.openxmlformats.org/officeDocument/2006/math" xmlns:mc="http://schemas.openxmlformats.org/markup-compatibility/2006" xmlns:mo="http://schemas.microsoft.com/office/mac/office/2008/main" xmlns:mv="urn:schemas-microsoft-com:mac:vml" xmlns:o="urn:schemas-microsoft-com:office:office" xmlns:r="http://schemas.openxmlformats.org/officeDocument/2006/relationships" xmlns:v="urn:schemas-microsoft-com:vml" xmlns:w10="urn:schemas-microsoft-com:office:word" xmlns:w14="http://schemas.microsoft.com/office/word/2010/wordml" xmlns:w="http://schemas.openxmlformats.org/wordprocessingml/2006/main" xmlns:wne="http://schemas.microsoft.com/office/word/2006/wordml" xmlns:wp14="http://schemas.microsoft.com/office/word/2010/wordprocessingDrawing" xmlns:wp="http://schemas.openxmlformats.org/drawingml/2006/wordprocessingDrawing" xmlns:wpc="http://schemas.microsoft.com/office/word/2010/wordprocessingCanvas" xmlns:wpg="http://schemas.microsoft.com/office/word/2010/wordprocessingGroup" xmlns:wpi="http://schemas.microsoft.com/office/word/2010/wordprocessingInk" xmlns:wps="http://schemas.microsoft.com/office/word/2010/wordprocessingShape" mc:Ignorable="w14 wp14">
-  <w:p>
-    <w:pPr>
-      <w:pStyle w:val="Footer"/>
-      <w:jc w:val="center"/>
-    </w:pPr>
-    <w:r>
-      <w:rPr>
-        <w:rFonts w:ascii="Calibri" w:hAnsi="Calibri"/>
-        <w:b w:val="0"/>
-        <w:color w:val="596379"/>
-        <w:sz w:val="17"/>
-      </w:rPr>
-      <w:t>Atividade Extensionista II - Leandro Andalaft dos Santos Junior - RU 4548358</w:t>
-    </w:r>
-  </w:p>
-</w:ftr>
 </file>
 
 <file path=word/numbering.xml><?xml version="1.0" encoding="utf-8"?>
@@ -2875,6 +1578,9 @@
     <w:name w:val="Normal"/>
     <w:qFormat/>
     <w:rsid w:val="00FC693F"/>
+    <w:pPr>
+      <w:spacing w:after="120" w:line="269" w:lineRule="auto"/>
+    </w:pPr>
     <w:rPr>
       <w:rFonts w:ascii="Calibri" w:hAnsi="Calibri"/>
       <w:sz w:val="21"/>
@@ -2935,15 +1641,15 @@
     <w:pPr>
       <w:keepNext/>
       <w:keepLines/>
-      <w:spacing w:before="480" w:after="0"/>
+      <w:spacing w:before="200" w:after="100"/>
       <w:outlineLvl w:val="0"/>
     </w:pPr>
     <w:rPr>
       <w:rFonts w:asciiTheme="majorHAnsi" w:eastAsiaTheme="majorEastAsia" w:hAnsiTheme="majorHAnsi" w:cstheme="majorBidi" w:ascii="Calibri" w:hAnsi="Calibri"/>
       <w:b/>
       <w:bCs/>
-      <w:color w:val="292F63"/>
-      <w:sz w:val="28"/>
+      <w:color w:val="26315F"/>
+      <w:sz w:val="30"/>
       <w:szCs w:val="28"/>
     </w:rPr>
   </w:style>
@@ -2959,15 +1665,15 @@
     <w:pPr>
       <w:keepNext/>
       <w:keepLines/>
-      <w:spacing w:before="200" w:after="0"/>
+      <w:spacing w:before="200" w:after="100"/>
       <w:outlineLvl w:val="1"/>
     </w:pPr>
     <w:rPr>
       <w:rFonts w:asciiTheme="majorHAnsi" w:eastAsiaTheme="majorEastAsia" w:hAnsiTheme="majorHAnsi" w:cstheme="majorBidi" w:ascii="Calibri" w:hAnsi="Calibri"/>
       <w:b/>
       <w:bCs/>
-      <w:color w:val="292F63"/>
-      <w:sz w:val="26"/>
+      <w:color w:val="1D4ED8"/>
+      <w:sz w:val="25"/>
       <w:szCs w:val="26"/>
     </w:rPr>
   </w:style>
@@ -2983,14 +1689,15 @@
     <w:pPr>
       <w:keepNext/>
       <w:keepLines/>
-      <w:spacing w:before="200" w:after="0"/>
+      <w:spacing w:before="200" w:after="100"/>
       <w:outlineLvl w:val="2"/>
     </w:pPr>
     <w:rPr>
       <w:rFonts w:asciiTheme="majorHAnsi" w:eastAsiaTheme="majorEastAsia" w:hAnsiTheme="majorHAnsi" w:cstheme="majorBidi" w:ascii="Calibri" w:hAnsi="Calibri"/>
       <w:b/>
       <w:bCs/>
-      <w:color w:val="292F63"/>
+      <w:color w:val="334155"/>
+      <w:sz w:val="23"/>
     </w:rPr>
   </w:style>
   <w:style w:type="paragraph" w:styleId="Heading4">

</xml_diff>